<commit_message>
Añadidos mensajes y quitado lo innecesario
</commit_message>
<xml_diff>
--- a/reporte/U4_TechStore_Informe.docx
+++ b/reporte/U4_TechStore_Informe.docx
@@ -914,7 +914,7 @@
           <w:rPr>
             <w:rStyle w:val="Hipervnculo"/>
           </w:rPr>
-          <w:t>https://github.com/ileosalazar/techstore-u4</w:t>
+          <w:t>https://github.com/Santana-R/techstore-u4</w:t>
         </w:r>
       </w:hyperlink>
     </w:p>
@@ -1290,6 +1290,7 @@
       </w:pPr>
       <w:r>
         <w:rPr>
+          <w:noProof/>
           <w:sz w:val="24"/>
           <w:szCs w:val="24"/>
         </w:rPr>
@@ -1661,12 +1662,6 @@
     <w:p>
       <w:pPr>
         <w:jc w:val="both"/>
-        <w:rPr>
-          <w:bCs/>
-          <w:sz w:val="24"/>
-          <w:szCs w:val="24"/>
-          <w:lang w:val="es-MX"/>
-        </w:rPr>
       </w:pPr>
       <w:r>
         <w:rPr>
@@ -1681,12 +1676,8 @@
         <w:r>
           <w:rPr>
             <w:rStyle w:val="Hipervnculo"/>
-            <w:bCs/>
-            <w:sz w:val="24"/>
-            <w:szCs w:val="24"/>
-            <w:lang w:val="es-MX"/>
           </w:rPr>
-          <w:t>https://github.com/ileosalazar/techstore-u4</w:t>
+          <w:t>https://github.com/Santana-R/techstore-u4</w:t>
         </w:r>
       </w:hyperlink>
     </w:p>
@@ -1749,27 +1740,7 @@
           <w:u w:val="single"/>
           <w:lang w:val="es-MX"/>
         </w:rPr>
-        <w:t>B</w:t>
-      </w:r>
-      <w:r>
-        <w:rPr>
-          <w:bCs/>
-          <w:sz w:val="24"/>
-          <w:szCs w:val="24"/>
-          <w:u w:val="single"/>
-          <w:lang w:val="es-MX"/>
-        </w:rPr>
-        <w:t>ash</w:t>
-      </w:r>
-      <w:r>
-        <w:rPr>
-          <w:bCs/>
-          <w:sz w:val="24"/>
-          <w:szCs w:val="24"/>
-          <w:u w:val="single"/>
-          <w:lang w:val="es-MX"/>
-        </w:rPr>
-        <w:t>:</w:t>
+        <w:t>Bash:</w:t>
       </w:r>
     </w:p>
     <w:p>
@@ -1914,6 +1885,89 @@
           <w:bCs/>
           <w:sz w:val="24"/>
           <w:szCs w:val="24"/>
+          <w:lang w:val="es-MX"/>
+        </w:rPr>
+      </w:pPr>
+      <w:r>
+        <w:rPr>
+          <w:bCs/>
+          <w:sz w:val="24"/>
+          <w:szCs w:val="24"/>
+          <w:u w:val="single"/>
+          <w:lang w:val="es-MX"/>
+        </w:rPr>
+        <w:t>Bash:</w:t>
+      </w:r>
+    </w:p>
+    <w:p>
+      <w:pPr>
+        <w:jc w:val="both"/>
+        <w:rPr>
+          <w:bCs/>
+          <w:sz w:val="24"/>
+          <w:szCs w:val="24"/>
+          <w:lang w:val="en-US"/>
+        </w:rPr>
+      </w:pPr>
+      <w:proofErr w:type="gramStart"/>
+      <w:r>
+        <w:rPr>
+          <w:bCs/>
+          <w:sz w:val="24"/>
+          <w:szCs w:val="24"/>
+          <w:lang w:val="en-US"/>
+        </w:rPr>
+        <w:t>source .</w:t>
+      </w:r>
+      <w:proofErr w:type="spellStart"/>
+      <w:r>
+        <w:rPr>
+          <w:bCs/>
+          <w:sz w:val="24"/>
+          <w:szCs w:val="24"/>
+          <w:lang w:val="en-US"/>
+        </w:rPr>
+        <w:t>venv</w:t>
+      </w:r>
+      <w:proofErr w:type="spellEnd"/>
+      <w:proofErr w:type="gramEnd"/>
+      <w:r>
+        <w:rPr>
+          <w:bCs/>
+          <w:sz w:val="24"/>
+          <w:szCs w:val="24"/>
+          <w:lang w:val="en-US"/>
+        </w:rPr>
+        <w:t>/bin/activate</w:t>
+      </w:r>
+    </w:p>
+    <w:p>
+      <w:pPr>
+        <w:jc w:val="both"/>
+        <w:rPr>
+          <w:bCs/>
+          <w:sz w:val="24"/>
+          <w:szCs w:val="24"/>
+          <w:lang w:val="en-US"/>
+        </w:rPr>
+      </w:pPr>
+      <w:r>
+        <w:rPr>
+          <w:bCs/>
+          <w:sz w:val="24"/>
+          <w:szCs w:val="24"/>
+          <w:lang w:val="en-US"/>
+        </w:rPr>
+        <w:t>En Windows PowerShell:</w:t>
+      </w:r>
+    </w:p>
+    <w:p>
+      <w:pPr>
+        <w:jc w:val="both"/>
+        <w:rPr>
+          <w:bCs/>
+          <w:sz w:val="24"/>
+          <w:szCs w:val="24"/>
           <w:lang w:val="en-US"/>
         </w:rPr>
       </w:pPr>
@@ -1925,9 +1979,177 @@
           <w:u w:val="single"/>
           <w:lang w:val="en-US"/>
         </w:rPr>
-        <w:t>Bas</w:t>
-      </w:r>
-      <w:r>
+        <w:t>PowerShell:</w:t>
+      </w:r>
+    </w:p>
+    <w:p>
+      <w:pPr>
+        <w:jc w:val="both"/>
+        <w:rPr>
+          <w:bCs/>
+          <w:sz w:val="24"/>
+          <w:szCs w:val="24"/>
+          <w:lang w:val="en-US"/>
+        </w:rPr>
+      </w:pPr>
+      <w:r>
+        <w:rPr>
+          <w:bCs/>
+          <w:sz w:val="24"/>
+          <w:szCs w:val="24"/>
+          <w:lang w:val="en-US"/>
+        </w:rPr>
+        <w:t>.</w:t>
+      </w:r>
+      <w:proofErr w:type="spellStart"/>
+      <w:r>
+        <w:rPr>
+          <w:bCs/>
+          <w:sz w:val="24"/>
+          <w:szCs w:val="24"/>
+          <w:lang w:val="en-US"/>
+        </w:rPr>
+        <w:t>venv</w:t>
+      </w:r>
+      <w:proofErr w:type="spellEnd"/>
+      <w:r>
+        <w:rPr>
+          <w:bCs/>
+          <w:sz w:val="24"/>
+          <w:szCs w:val="24"/>
+          <w:lang w:val="en-US"/>
+        </w:rPr>
+        <w:t>\Scripts\Activate.ps1</w:t>
+      </w:r>
+    </w:p>
+    <w:p>
+      <w:pPr>
+        <w:jc w:val="both"/>
+        <w:rPr>
+          <w:bCs/>
+          <w:sz w:val="24"/>
+          <w:szCs w:val="24"/>
+          <w:lang w:val="en-US"/>
+        </w:rPr>
+      </w:pPr>
+    </w:p>
+    <w:p>
+      <w:pPr>
+        <w:jc w:val="both"/>
+        <w:rPr>
+          <w:bCs/>
+          <w:sz w:val="24"/>
+          <w:szCs w:val="24"/>
+          <w:lang w:val="en-US"/>
+        </w:rPr>
+      </w:pPr>
+    </w:p>
+    <w:p>
+      <w:pPr>
+        <w:jc w:val="both"/>
+        <w:rPr>
+          <w:bCs/>
+          <w:sz w:val="24"/>
+          <w:szCs w:val="24"/>
+          <w:lang w:val="en-US"/>
+        </w:rPr>
+      </w:pPr>
+      <w:r>
+        <w:rPr>
+          <w:bCs/>
+          <w:sz w:val="24"/>
+          <w:szCs w:val="24"/>
+          <w:lang w:val="en-US"/>
+        </w:rPr>
+        <w:lastRenderedPageBreak/>
+        <w:t>En Windows CMD:</w:t>
+      </w:r>
+    </w:p>
+    <w:p>
+      <w:pPr>
+        <w:jc w:val="both"/>
+        <w:rPr>
+          <w:bCs/>
+          <w:sz w:val="24"/>
+          <w:szCs w:val="24"/>
+          <w:u w:val="single"/>
+          <w:lang w:val="es-MX"/>
+        </w:rPr>
+      </w:pPr>
+      <w:r>
+        <w:rPr>
+          <w:bCs/>
+          <w:sz w:val="24"/>
+          <w:szCs w:val="24"/>
+          <w:u w:val="single"/>
+          <w:lang w:val="es-MX"/>
+        </w:rPr>
+        <w:t>Bat:</w:t>
+      </w:r>
+    </w:p>
+    <w:p>
+      <w:pPr>
+        <w:jc w:val="both"/>
+        <w:rPr>
+          <w:bCs/>
+          <w:sz w:val="24"/>
+          <w:szCs w:val="24"/>
+          <w:lang w:val="es-MX"/>
+        </w:rPr>
+      </w:pPr>
+      <w:r>
+        <w:rPr>
+          <w:bCs/>
+          <w:sz w:val="24"/>
+          <w:szCs w:val="24"/>
+          <w:lang w:val="es-MX"/>
+        </w:rPr>
+        <w:t>.</w:t>
+      </w:r>
+      <w:proofErr w:type="spellStart"/>
+      <w:r>
+        <w:rPr>
+          <w:bCs/>
+          <w:sz w:val="24"/>
+          <w:szCs w:val="24"/>
+          <w:lang w:val="es-MX"/>
+        </w:rPr>
+        <w:t>venv</w:t>
+      </w:r>
+      <w:proofErr w:type="spellEnd"/>
+      <w:r>
+        <w:rPr>
+          <w:bCs/>
+          <w:sz w:val="24"/>
+          <w:szCs w:val="24"/>
+          <w:lang w:val="es-MX"/>
+        </w:rPr>
+        <w:t>\Scripts\activate.bat</w:t>
+      </w:r>
+    </w:p>
+    <w:p>
+      <w:pPr>
+        <w:jc w:val="both"/>
+        <w:rPr>
+          <w:bCs/>
+          <w:sz w:val="24"/>
+          <w:szCs w:val="24"/>
+          <w:lang w:val="es-MX"/>
+        </w:rPr>
+      </w:pPr>
+      <w:r>
+        <w:rPr>
+          <w:bCs/>
+          <w:sz w:val="24"/>
+          <w:szCs w:val="24"/>
+          <w:lang w:val="es-MX"/>
+        </w:rPr>
+        <w:t>Instala las versiones verificadas:</w:t>
+      </w:r>
+    </w:p>
+    <w:p>
+      <w:pPr>
+        <w:jc w:val="both"/>
         <w:rPr>
           <w:bCs/>
           <w:sz w:val="24"/>
@@ -1935,28 +2157,106 @@
           <w:u w:val="single"/>
           <w:lang w:val="en-US"/>
         </w:rPr>
-        <w:t>h:</w:t>
-      </w:r>
-    </w:p>
-    <w:p>
-      <w:pPr>
-        <w:jc w:val="both"/>
-        <w:rPr>
-          <w:bCs/>
-          <w:sz w:val="24"/>
-          <w:szCs w:val="24"/>
+      </w:pPr>
+      <w:r>
+        <w:rPr>
+          <w:bCs/>
+          <w:sz w:val="24"/>
+          <w:szCs w:val="24"/>
+          <w:u w:val="single"/>
           <w:lang w:val="en-US"/>
         </w:rPr>
-      </w:pPr>
+        <w:t>Bash:</w:t>
+      </w:r>
+    </w:p>
+    <w:p>
+      <w:pPr>
+        <w:jc w:val="both"/>
+        <w:rPr>
+          <w:bCs/>
+          <w:sz w:val="24"/>
+          <w:szCs w:val="24"/>
+          <w:lang w:val="en-US"/>
+        </w:rPr>
+      </w:pPr>
+      <w:r>
+        <w:rPr>
+          <w:bCs/>
+          <w:sz w:val="24"/>
+          <w:szCs w:val="24"/>
+          <w:lang w:val="en-US"/>
+        </w:rPr>
+        <w:t>python -m pip install -r requirements.txt</w:t>
+      </w:r>
+    </w:p>
+    <w:p>
+      <w:pPr>
+        <w:jc w:val="both"/>
+        <w:rPr>
+          <w:bCs/>
+          <w:sz w:val="24"/>
+          <w:szCs w:val="24"/>
+          <w:lang w:val="es-MX"/>
+        </w:rPr>
+      </w:pPr>
+      <w:r>
+        <w:rPr>
+          <w:bCs/>
+          <w:sz w:val="24"/>
+          <w:szCs w:val="24"/>
+          <w:lang w:val="es-MX"/>
+        </w:rPr>
+        <w:t>Si PowerShell bloquea la activación, usa directamente `.</w:t>
+      </w:r>
+      <w:proofErr w:type="spellStart"/>
+      <w:r>
+        <w:rPr>
+          <w:bCs/>
+          <w:sz w:val="24"/>
+          <w:szCs w:val="24"/>
+          <w:lang w:val="es-MX"/>
+        </w:rPr>
+        <w:t>venv</w:t>
+      </w:r>
+      <w:proofErr w:type="spellEnd"/>
+      <w:r>
+        <w:rPr>
+          <w:bCs/>
+          <w:sz w:val="24"/>
+          <w:szCs w:val="24"/>
+          <w:lang w:val="es-MX"/>
+        </w:rPr>
+        <w:t>\Scripts\python.exe` en lugar de `</w:t>
+      </w:r>
+      <w:proofErr w:type="spellStart"/>
+      <w:r>
+        <w:rPr>
+          <w:bCs/>
+          <w:sz w:val="24"/>
+          <w:szCs w:val="24"/>
+          <w:lang w:val="es-MX"/>
+        </w:rPr>
+        <w:t>python</w:t>
+      </w:r>
+      <w:proofErr w:type="spellEnd"/>
+      <w:r>
+        <w:rPr>
+          <w:bCs/>
+          <w:sz w:val="24"/>
+          <w:szCs w:val="24"/>
+          <w:lang w:val="es-MX"/>
+        </w:rPr>
+        <w:t xml:space="preserve">`. En macOS o Linux, usa </w:t>
+      </w:r>
       <w:proofErr w:type="gramStart"/>
       <w:r>
         <w:rPr>
           <w:bCs/>
           <w:sz w:val="24"/>
           <w:szCs w:val="24"/>
-          <w:lang w:val="en-US"/>
-        </w:rPr>
-        <w:t>source .</w:t>
+          <w:lang w:val="es-MX"/>
+        </w:rPr>
+        <w:t>`.</w:t>
       </w:r>
       <w:proofErr w:type="spellStart"/>
       <w:r>
@@ -1964,7 +2264,7 @@
           <w:bCs/>
           <w:sz w:val="24"/>
           <w:szCs w:val="24"/>
-          <w:lang w:val="en-US"/>
+          <w:lang w:val="es-MX"/>
         </w:rPr>
         <w:t>venv</w:t>
       </w:r>
@@ -1975,21 +2275,195 @@
           <w:bCs/>
           <w:sz w:val="24"/>
           <w:szCs w:val="24"/>
+          <w:lang w:val="es-MX"/>
+        </w:rPr>
+        <w:t>/</w:t>
+      </w:r>
+      <w:proofErr w:type="spellStart"/>
+      <w:r>
+        <w:rPr>
+          <w:bCs/>
+          <w:sz w:val="24"/>
+          <w:szCs w:val="24"/>
+          <w:lang w:val="es-MX"/>
+        </w:rPr>
+        <w:t>bin</w:t>
+      </w:r>
+      <w:proofErr w:type="spellEnd"/>
+      <w:r>
+        <w:rPr>
+          <w:bCs/>
+          <w:sz w:val="24"/>
+          <w:szCs w:val="24"/>
+          <w:lang w:val="es-MX"/>
+        </w:rPr>
+        <w:t>/</w:t>
+      </w:r>
+      <w:proofErr w:type="spellStart"/>
+      <w:r>
+        <w:rPr>
+          <w:bCs/>
+          <w:sz w:val="24"/>
+          <w:szCs w:val="24"/>
+          <w:lang w:val="es-MX"/>
+        </w:rPr>
+        <w:t>python</w:t>
+      </w:r>
+      <w:proofErr w:type="spellEnd"/>
+      <w:r>
+        <w:rPr>
+          <w:bCs/>
+          <w:sz w:val="24"/>
+          <w:szCs w:val="24"/>
+          <w:lang w:val="es-MX"/>
+        </w:rPr>
+        <w:t>`. La instalación ocurre dentro del entorno virtual.</w:t>
+      </w:r>
+    </w:p>
+    <w:p>
+      <w:pPr>
+        <w:jc w:val="both"/>
+        <w:rPr>
+          <w:b/>
+          <w:sz w:val="24"/>
+          <w:szCs w:val="24"/>
+          <w:lang w:val="es-MX"/>
+        </w:rPr>
+      </w:pPr>
+      <w:r>
+        <w:rPr>
+          <w:b/>
+          <w:sz w:val="24"/>
+          <w:szCs w:val="24"/>
+          <w:lang w:val="es-MX"/>
+        </w:rPr>
+        <w:t>Ejecución y comprobación:</w:t>
+      </w:r>
+    </w:p>
+    <w:p>
+      <w:pPr>
+        <w:jc w:val="both"/>
+        <w:rPr>
+          <w:bCs/>
+          <w:sz w:val="24"/>
+          <w:szCs w:val="24"/>
+          <w:lang w:val="es-MX"/>
+        </w:rPr>
+      </w:pPr>
+      <w:r>
+        <w:rPr>
+          <w:bCs/>
+          <w:sz w:val="24"/>
+          <w:szCs w:val="24"/>
+          <w:lang w:val="es-MX"/>
+        </w:rPr>
+        <w:t>Ejecuta desde la raíz del proyecto:</w:t>
+      </w:r>
+    </w:p>
+    <w:p>
+      <w:pPr>
+        <w:jc w:val="both"/>
+        <w:rPr>
+          <w:bCs/>
+          <w:sz w:val="24"/>
+          <w:szCs w:val="24"/>
+          <w:u w:val="single"/>
+          <w:lang w:val="es-MX"/>
+        </w:rPr>
+      </w:pPr>
+      <w:r>
+        <w:rPr>
+          <w:bCs/>
+          <w:sz w:val="24"/>
+          <w:szCs w:val="24"/>
+          <w:u w:val="single"/>
+          <w:lang w:val="es-MX"/>
+        </w:rPr>
+        <w:t>Bash:</w:t>
+      </w:r>
+    </w:p>
+    <w:p>
+      <w:pPr>
+        <w:jc w:val="both"/>
+        <w:rPr>
+          <w:bCs/>
+          <w:sz w:val="24"/>
+          <w:szCs w:val="24"/>
+          <w:lang w:val="es-MX"/>
+        </w:rPr>
+      </w:pPr>
+      <w:proofErr w:type="spellStart"/>
+      <w:r>
+        <w:rPr>
+          <w:bCs/>
+          <w:sz w:val="24"/>
+          <w:szCs w:val="24"/>
+          <w:lang w:val="es-MX"/>
+        </w:rPr>
+        <w:t>python</w:t>
+      </w:r>
+      <w:proofErr w:type="spellEnd"/>
+      <w:r>
+        <w:rPr>
+          <w:bCs/>
+          <w:sz w:val="24"/>
+          <w:szCs w:val="24"/>
+          <w:lang w:val="es-MX"/>
+        </w:rPr>
+        <w:t xml:space="preserve"> cargar_csv.py</w:t>
+      </w:r>
+    </w:p>
+    <w:p>
+      <w:pPr>
+        <w:jc w:val="both"/>
+        <w:rPr>
+          <w:bCs/>
+          <w:sz w:val="24"/>
+          <w:szCs w:val="24"/>
+          <w:lang w:val="es-MX"/>
+        </w:rPr>
+      </w:pPr>
+      <w:proofErr w:type="spellStart"/>
+      <w:r>
+        <w:rPr>
+          <w:bCs/>
+          <w:sz w:val="24"/>
+          <w:szCs w:val="24"/>
+          <w:lang w:val="es-MX"/>
+        </w:rPr>
+        <w:t>python</w:t>
+      </w:r>
+      <w:proofErr w:type="spellEnd"/>
+      <w:r>
+        <w:rPr>
+          <w:bCs/>
+          <w:sz w:val="24"/>
+          <w:szCs w:val="24"/>
+          <w:lang w:val="es-MX"/>
+        </w:rPr>
+        <w:t xml:space="preserve"> ejecutar_escenarios.py</w:t>
+      </w:r>
+    </w:p>
+    <w:p>
+      <w:pPr>
+        <w:jc w:val="both"/>
+        <w:rPr>
+          <w:bCs/>
+          <w:sz w:val="24"/>
+          <w:szCs w:val="24"/>
           <w:lang w:val="en-US"/>
         </w:rPr>
-        <w:t>/bin/activate</w:t>
-      </w:r>
-    </w:p>
-    <w:p>
-      <w:pPr>
-        <w:jc w:val="both"/>
+      </w:pPr>
+      <w:r>
         <w:rPr>
           <w:bCs/>
           <w:sz w:val="24"/>
           <w:szCs w:val="24"/>
           <w:lang w:val="en-US"/>
         </w:rPr>
-      </w:pPr>
+        <w:t xml:space="preserve">python -m </w:t>
+      </w:r>
+      <w:proofErr w:type="spellStart"/>
       <w:r>
         <w:rPr>
           <w:bCs/>
@@ -1997,40 +2471,39 @@
           <w:szCs w:val="24"/>
           <w:lang w:val="en-US"/>
         </w:rPr>
-        <w:t>En Windows PowerShell:</w:t>
-      </w:r>
-    </w:p>
-    <w:p>
-      <w:pPr>
-        <w:jc w:val="both"/>
+        <w:t>pytest</w:t>
+      </w:r>
+      <w:proofErr w:type="spellEnd"/>
+      <w:r>
         <w:rPr>
           <w:bCs/>
           <w:sz w:val="24"/>
           <w:szCs w:val="24"/>
           <w:lang w:val="en-US"/>
         </w:rPr>
-      </w:pPr>
-      <w:r>
-        <w:rPr>
-          <w:bCs/>
-          <w:sz w:val="24"/>
-          <w:szCs w:val="24"/>
-          <w:u w:val="single"/>
+        <w:t xml:space="preserve"> -q</w:t>
+      </w:r>
+    </w:p>
+    <w:p>
+      <w:pPr>
+        <w:jc w:val="both"/>
+        <w:rPr>
+          <w:bCs/>
+          <w:sz w:val="24"/>
+          <w:szCs w:val="24"/>
           <w:lang w:val="en-US"/>
         </w:rPr>
-        <w:t>PowerShell:</w:t>
-      </w:r>
-    </w:p>
-    <w:p>
-      <w:pPr>
-        <w:jc w:val="both"/>
+      </w:pPr>
+      <w:r>
         <w:rPr>
           <w:bCs/>
           <w:sz w:val="24"/>
           <w:szCs w:val="24"/>
           <w:lang w:val="en-US"/>
         </w:rPr>
-      </w:pPr>
+        <w:t xml:space="preserve">python -m </w:t>
+      </w:r>
+      <w:proofErr w:type="spellStart"/>
       <w:r>
         <w:rPr>
           <w:bCs/>
@@ -2038,7 +2511,17 @@
           <w:szCs w:val="24"/>
           <w:lang w:val="en-US"/>
         </w:rPr>
-        <w:t>.</w:t>
+        <w:t>uvicorn</w:t>
+      </w:r>
+      <w:proofErr w:type="spellEnd"/>
+      <w:r>
+        <w:rPr>
+          <w:bCs/>
+          <w:sz w:val="24"/>
+          <w:szCs w:val="24"/>
+          <w:lang w:val="en-US"/>
+        </w:rPr>
+        <w:t xml:space="preserve"> </w:t>
       </w:r>
       <w:proofErr w:type="spellStart"/>
       <w:r>
@@ -2048,7 +2531,7 @@
           <w:szCs w:val="24"/>
           <w:lang w:val="en-US"/>
         </w:rPr>
-        <w:t>venv</w:t>
+        <w:t>app.api:app</w:t>
       </w:r>
       <w:proofErr w:type="spellEnd"/>
       <w:r>
@@ -2058,7 +2541,212 @@
           <w:szCs w:val="24"/>
           <w:lang w:val="en-US"/>
         </w:rPr>
-        <w:t>\Scripts\Activate.ps1</w:t>
+        <w:t xml:space="preserve"> --reload</w:t>
+      </w:r>
+    </w:p>
+    <w:p>
+      <w:pPr>
+        <w:jc w:val="both"/>
+        <w:rPr>
+          <w:bCs/>
+          <w:sz w:val="24"/>
+          <w:szCs w:val="24"/>
+          <w:lang w:val="es-MX"/>
+        </w:rPr>
+      </w:pPr>
+      <w:r>
+        <w:rPr>
+          <w:bCs/>
+          <w:sz w:val="24"/>
+          <w:szCs w:val="24"/>
+          <w:lang w:val="es-MX"/>
+        </w:rPr>
+        <w:t>El cargador muestra los 16 pedidos en DRAFT. O001 debe tener 4 unidades y 2100.00 MXN. El ejecutor verifica E01 a E15 con datos nuevos por caso y actualiza `evidencias/</w:t>
+      </w:r>
+      <w:proofErr w:type="spellStart"/>
+      <w:r>
+        <w:rPr>
+          <w:bCs/>
+          <w:sz w:val="24"/>
+          <w:szCs w:val="24"/>
+          <w:lang w:val="es-MX"/>
+        </w:rPr>
+        <w:t>escenarios.json</w:t>
+      </w:r>
+      <w:proofErr w:type="spellEnd"/>
+      <w:r>
+        <w:rPr>
+          <w:bCs/>
+          <w:sz w:val="24"/>
+          <w:szCs w:val="24"/>
+          <w:lang w:val="es-MX"/>
+        </w:rPr>
+        <w:t xml:space="preserve">` y `evidencias/bitacora.csv`. </w:t>
+      </w:r>
+      <w:proofErr w:type="spellStart"/>
+      <w:r>
+        <w:rPr>
+          <w:bCs/>
+          <w:sz w:val="24"/>
+          <w:szCs w:val="24"/>
+          <w:lang w:val="es-MX"/>
+        </w:rPr>
+        <w:t>pytest</w:t>
+      </w:r>
+      <w:proofErr w:type="spellEnd"/>
+      <w:r>
+        <w:rPr>
+          <w:bCs/>
+          <w:sz w:val="24"/>
+          <w:szCs w:val="24"/>
+          <w:lang w:val="es-MX"/>
+        </w:rPr>
+        <w:t xml:space="preserve"> debe informar 90 pruebas aprobadas.</w:t>
+      </w:r>
+    </w:p>
+    <w:p>
+      <w:pPr>
+        <w:jc w:val="both"/>
+        <w:rPr>
+          <w:bCs/>
+          <w:sz w:val="24"/>
+          <w:szCs w:val="24"/>
+          <w:lang w:val="es-MX"/>
+        </w:rPr>
+      </w:pPr>
+      <w:r>
+        <w:rPr>
+          <w:bCs/>
+          <w:sz w:val="24"/>
+          <w:szCs w:val="24"/>
+          <w:lang w:val="es-MX"/>
+        </w:rPr>
+        <w:t xml:space="preserve">Swagger se abre en http://127.0.0.1:8000/docs y el contrato </w:t>
+      </w:r>
+      <w:proofErr w:type="spellStart"/>
+      <w:r>
+        <w:rPr>
+          <w:bCs/>
+          <w:sz w:val="24"/>
+          <w:szCs w:val="24"/>
+          <w:lang w:val="es-MX"/>
+        </w:rPr>
+        <w:t>OpenAPI</w:t>
+      </w:r>
+      <w:proofErr w:type="spellEnd"/>
+      <w:r>
+        <w:rPr>
+          <w:bCs/>
+          <w:sz w:val="24"/>
+          <w:szCs w:val="24"/>
+          <w:lang w:val="es-MX"/>
+        </w:rPr>
+        <w:t xml:space="preserve"> está en http://127.0.0.1:8000/openapi.json. Las capturas del reporte usaron el puerto 8764; es la misma aplicación. Detén el servidor con </w:t>
+      </w:r>
+      <w:proofErr w:type="spellStart"/>
+      <w:r>
+        <w:rPr>
+          <w:bCs/>
+          <w:sz w:val="24"/>
+          <w:szCs w:val="24"/>
+          <w:lang w:val="es-MX"/>
+        </w:rPr>
+        <w:t>Ctrl+C</w:t>
+      </w:r>
+      <w:proofErr w:type="spellEnd"/>
+      <w:r>
+        <w:rPr>
+          <w:bCs/>
+          <w:sz w:val="24"/>
+          <w:szCs w:val="24"/>
+          <w:lang w:val="es-MX"/>
+        </w:rPr>
+        <w:t>. Al reiniciarlo, todos los pedidos vuelven a DRAFT.</w:t>
+      </w:r>
+    </w:p>
+    <w:p>
+      <w:pPr>
+        <w:jc w:val="both"/>
+        <w:rPr>
+          <w:b/>
+          <w:sz w:val="24"/>
+          <w:szCs w:val="24"/>
+          <w:lang w:val="es-MX"/>
+        </w:rPr>
+      </w:pPr>
+    </w:p>
+    <w:p>
+      <w:pPr>
+        <w:jc w:val="both"/>
+        <w:rPr>
+          <w:b/>
+          <w:sz w:val="24"/>
+          <w:szCs w:val="24"/>
+          <w:lang w:val="es-MX"/>
+        </w:rPr>
+      </w:pPr>
+    </w:p>
+    <w:p>
+      <w:pPr>
+        <w:jc w:val="both"/>
+        <w:rPr>
+          <w:b/>
+          <w:sz w:val="24"/>
+          <w:szCs w:val="24"/>
+          <w:lang w:val="es-MX"/>
+        </w:rPr>
+      </w:pPr>
+    </w:p>
+    <w:p>
+      <w:pPr>
+        <w:jc w:val="both"/>
+        <w:rPr>
+          <w:b/>
+          <w:sz w:val="24"/>
+          <w:szCs w:val="24"/>
+          <w:lang w:val="es-MX"/>
+        </w:rPr>
+      </w:pPr>
+    </w:p>
+    <w:p>
+      <w:pPr>
+        <w:jc w:val="both"/>
+        <w:rPr>
+          <w:b/>
+          <w:sz w:val="24"/>
+          <w:szCs w:val="24"/>
+          <w:lang w:val="es-MX"/>
+        </w:rPr>
+      </w:pPr>
+      <w:r>
+        <w:rPr>
+          <w:b/>
+          <w:sz w:val="24"/>
+          <w:szCs w:val="24"/>
+          <w:lang w:val="es-MX"/>
+        </w:rPr>
+        <w:lastRenderedPageBreak/>
+        <w:t>Estructura:</w:t>
+      </w:r>
+    </w:p>
+    <w:p>
+      <w:pPr>
+        <w:jc w:val="both"/>
+        <w:rPr>
+          <w:bCs/>
+          <w:sz w:val="24"/>
+          <w:szCs w:val="24"/>
+          <w:lang w:val="es-MX"/>
+        </w:rPr>
+      </w:pPr>
+      <w:r>
+        <w:rPr>
+          <w:bCs/>
+          <w:sz w:val="24"/>
+          <w:szCs w:val="24"/>
+          <w:lang w:val="es-MX"/>
+        </w:rPr>
+        <w:t>app/domain.py          Entidades, VO, estados y eventos</w:t>
       </w:r>
     </w:p>
     <w:p>
@@ -2071,28 +2759,27 @@
           <w:lang w:val="en-US"/>
         </w:rPr>
       </w:pPr>
-    </w:p>
-    <w:p>
-      <w:pPr>
-        <w:jc w:val="both"/>
+      <w:proofErr w:type="gramStart"/>
+      <w:r>
         <w:rPr>
           <w:bCs/>
           <w:sz w:val="24"/>
           <w:szCs w:val="24"/>
           <w:lang w:val="en-US"/>
         </w:rPr>
-      </w:pPr>
-    </w:p>
-    <w:p>
-      <w:pPr>
-        <w:jc w:val="both"/>
+        <w:t>app/specifications.py  Reglas</w:t>
+      </w:r>
+      <w:proofErr w:type="gramEnd"/>
+      <w:r>
         <w:rPr>
           <w:bCs/>
           <w:sz w:val="24"/>
           <w:szCs w:val="24"/>
           <w:lang w:val="en-US"/>
         </w:rPr>
-      </w:pPr>
+        <w:t xml:space="preserve"> AND, OR y NOT; </w:t>
+      </w:r>
+      <w:proofErr w:type="spellStart"/>
       <w:r>
         <w:rPr>
           <w:bCs/>
@@ -2100,50 +2787,28 @@
           <w:szCs w:val="24"/>
           <w:lang w:val="en-US"/>
         </w:rPr>
-        <w:lastRenderedPageBreak/>
-        <w:t>En Windows CMD:</w:t>
-      </w:r>
-    </w:p>
-    <w:p>
-      <w:pPr>
-        <w:jc w:val="both"/>
-        <w:rPr>
-          <w:bCs/>
-          <w:sz w:val="24"/>
-          <w:szCs w:val="24"/>
-          <w:u w:val="single"/>
-          <w:lang w:val="en-US"/>
-        </w:rPr>
-      </w:pPr>
-      <w:r>
-        <w:rPr>
-          <w:bCs/>
-          <w:sz w:val="24"/>
-          <w:szCs w:val="24"/>
-          <w:u w:val="single"/>
-          <w:lang w:val="en-US"/>
-        </w:rPr>
-        <w:t>Bat:</w:t>
-      </w:r>
-    </w:p>
-    <w:p>
-      <w:pPr>
-        <w:jc w:val="both"/>
-        <w:rPr>
-          <w:bCs/>
-          <w:sz w:val="24"/>
-          <w:szCs w:val="24"/>
-          <w:lang w:val="en-US"/>
-        </w:rPr>
-      </w:pPr>
-      <w:r>
-        <w:rPr>
-          <w:bCs/>
-          <w:sz w:val="24"/>
-          <w:szCs w:val="24"/>
-          <w:lang w:val="en-US"/>
-        </w:rPr>
-        <w:t>.</w:t>
+        <w:t>descuentos</w:t>
+      </w:r>
+      <w:proofErr w:type="spellEnd"/>
+    </w:p>
+    <w:p>
+      <w:pPr>
+        <w:jc w:val="both"/>
+        <w:rPr>
+          <w:bCs/>
+          <w:sz w:val="24"/>
+          <w:szCs w:val="24"/>
+          <w:lang w:val="es-MX"/>
+        </w:rPr>
+      </w:pPr>
+      <w:r>
+        <w:rPr>
+          <w:bCs/>
+          <w:sz w:val="24"/>
+          <w:szCs w:val="24"/>
+          <w:lang w:val="es-MX"/>
+        </w:rPr>
+        <w:t xml:space="preserve">app/api.py             Adaptador HTTP y aplicación </w:t>
       </w:r>
       <w:proofErr w:type="spellStart"/>
       <w:r>
@@ -2151,73 +2816,31 @@
           <w:bCs/>
           <w:sz w:val="24"/>
           <w:szCs w:val="24"/>
-          <w:lang w:val="en-US"/>
-        </w:rPr>
-        <w:t>venv</w:t>
+          <w:lang w:val="es-MX"/>
+        </w:rPr>
+        <w:t>FastAPI</w:t>
       </w:r>
       <w:proofErr w:type="spellEnd"/>
-      <w:r>
-        <w:rPr>
-          <w:bCs/>
-          <w:sz w:val="24"/>
-          <w:szCs w:val="24"/>
-          <w:lang w:val="en-US"/>
-        </w:rPr>
-        <w:t>\Scripts\activate.bat</w:t>
-      </w:r>
-    </w:p>
-    <w:p>
-      <w:pPr>
-        <w:jc w:val="both"/>
-        <w:rPr>
-          <w:bCs/>
-          <w:sz w:val="24"/>
-          <w:szCs w:val="24"/>
-          <w:lang w:val="es-MX"/>
-        </w:rPr>
-      </w:pPr>
-      <w:r>
-        <w:rPr>
-          <w:bCs/>
-          <w:sz w:val="24"/>
-          <w:szCs w:val="24"/>
-          <w:lang w:val="es-MX"/>
-        </w:rPr>
-        <w:t>Instala las versiones verificadas:</w:t>
-      </w:r>
-    </w:p>
-    <w:p>
-      <w:pPr>
-        <w:jc w:val="both"/>
-        <w:rPr>
-          <w:bCs/>
-          <w:sz w:val="24"/>
-          <w:szCs w:val="24"/>
-          <w:u w:val="single"/>
-          <w:lang w:val="es-MX"/>
-        </w:rPr>
-      </w:pPr>
-      <w:r>
-        <w:rPr>
-          <w:bCs/>
-          <w:sz w:val="24"/>
-          <w:szCs w:val="24"/>
-          <w:u w:val="single"/>
-          <w:lang w:val="es-MX"/>
-        </w:rPr>
-        <w:t>Bash:</w:t>
-      </w:r>
-    </w:p>
-    <w:p>
-      <w:pPr>
-        <w:jc w:val="both"/>
-        <w:rPr>
-          <w:bCs/>
-          <w:sz w:val="24"/>
-          <w:szCs w:val="24"/>
-          <w:lang w:val="es-MX"/>
-        </w:rPr>
-      </w:pPr>
+    </w:p>
+    <w:p>
+      <w:pPr>
+        <w:jc w:val="both"/>
+        <w:rPr>
+          <w:bCs/>
+          <w:sz w:val="24"/>
+          <w:szCs w:val="24"/>
+          <w:lang w:val="es-MX"/>
+        </w:rPr>
+      </w:pPr>
+      <w:r>
+        <w:rPr>
+          <w:bCs/>
+          <w:sz w:val="24"/>
+          <w:szCs w:val="24"/>
+          <w:lang w:val="es-MX"/>
+        </w:rPr>
+        <w:t xml:space="preserve">datos/                 Los cinco CSV originales del </w:t>
+      </w:r>
       <w:proofErr w:type="spellStart"/>
       <w:r>
         <w:rPr>
@@ -2226,18 +2849,20 @@
           <w:szCs w:val="24"/>
           <w:lang w:val="es-MX"/>
         </w:rPr>
-        <w:t>python</w:t>
+        <w:t>inge</w:t>
       </w:r>
       <w:proofErr w:type="spellEnd"/>
-      <w:r>
-        <w:rPr>
-          <w:bCs/>
-          <w:sz w:val="24"/>
-          <w:szCs w:val="24"/>
-          <w:lang w:val="es-MX"/>
-        </w:rPr>
-        <w:t xml:space="preserve"> -m </w:t>
-      </w:r>
+    </w:p>
+    <w:p>
+      <w:pPr>
+        <w:jc w:val="both"/>
+        <w:rPr>
+          <w:bCs/>
+          <w:sz w:val="24"/>
+          <w:szCs w:val="24"/>
+          <w:lang w:val="es-MX"/>
+        </w:rPr>
+      </w:pPr>
       <w:proofErr w:type="spellStart"/>
       <w:r>
         <w:rPr>
@@ -2246,7 +2871,7 @@
           <w:szCs w:val="24"/>
           <w:lang w:val="es-MX"/>
         </w:rPr>
-        <w:t>pip</w:t>
+        <w:t>tests</w:t>
       </w:r>
       <w:proofErr w:type="spellEnd"/>
       <w:r>
@@ -2256,7 +2881,47 @@
           <w:szCs w:val="24"/>
           <w:lang w:val="es-MX"/>
         </w:rPr>
-        <w:t xml:space="preserve"> </w:t>
+        <w:t>/                 Dominio, reglas, API y escenarios</w:t>
+      </w:r>
+    </w:p>
+    <w:p>
+      <w:pPr>
+        <w:jc w:val="both"/>
+        <w:rPr>
+          <w:bCs/>
+          <w:sz w:val="24"/>
+          <w:szCs w:val="24"/>
+          <w:lang w:val="es-MX"/>
+        </w:rPr>
+      </w:pPr>
+      <w:r>
+        <w:rPr>
+          <w:bCs/>
+          <w:sz w:val="24"/>
+          <w:szCs w:val="24"/>
+          <w:lang w:val="es-MX"/>
+        </w:rPr>
+        <w:t>diagramas/             Draw.io editable y su PNG exportado</w:t>
+      </w:r>
+    </w:p>
+    <w:p>
+      <w:pPr>
+        <w:jc w:val="both"/>
+        <w:rPr>
+          <w:bCs/>
+          <w:sz w:val="24"/>
+          <w:szCs w:val="24"/>
+          <w:lang w:val="es-MX"/>
+        </w:rPr>
+      </w:pPr>
+      <w:r>
+        <w:rPr>
+          <w:bCs/>
+          <w:sz w:val="24"/>
+          <w:szCs w:val="24"/>
+          <w:lang w:val="es-MX"/>
+        </w:rPr>
+        <w:t xml:space="preserve">evidencias/            Bitácora, logs, </w:t>
       </w:r>
       <w:proofErr w:type="spellStart"/>
       <w:r>
@@ -2266,7 +2931,7 @@
           <w:szCs w:val="24"/>
           <w:lang w:val="es-MX"/>
         </w:rPr>
-        <w:t>install</w:t>
+        <w:t>OpenAPI</w:t>
       </w:r>
       <w:proofErr w:type="spellEnd"/>
       <w:r>
@@ -2276,68 +2941,90 @@
           <w:szCs w:val="24"/>
           <w:lang w:val="es-MX"/>
         </w:rPr>
-        <w:t xml:space="preserve"> -r requirements.txt</w:t>
-      </w:r>
-    </w:p>
-    <w:p>
-      <w:pPr>
-        <w:jc w:val="both"/>
-        <w:rPr>
-          <w:bCs/>
-          <w:sz w:val="24"/>
-          <w:szCs w:val="24"/>
-          <w:lang w:val="es-MX"/>
-        </w:rPr>
-      </w:pPr>
-      <w:r>
-        <w:rPr>
-          <w:bCs/>
-          <w:sz w:val="24"/>
-          <w:szCs w:val="24"/>
-          <w:lang w:val="es-MX"/>
-        </w:rPr>
-        <w:t>Si PowerShell bloquea la activación, usa directamente `.</w:t>
-      </w:r>
-      <w:proofErr w:type="spellStart"/>
-      <w:r>
-        <w:rPr>
-          <w:bCs/>
-          <w:sz w:val="24"/>
-          <w:szCs w:val="24"/>
-          <w:lang w:val="es-MX"/>
-        </w:rPr>
-        <w:t>venv</w:t>
-      </w:r>
-      <w:proofErr w:type="spellEnd"/>
-      <w:r>
-        <w:rPr>
-          <w:bCs/>
-          <w:sz w:val="24"/>
-          <w:szCs w:val="24"/>
-          <w:lang w:val="es-MX"/>
-        </w:rPr>
-        <w:t>\Scripts\python.exe` en lugar de `</w:t>
-      </w:r>
-      <w:proofErr w:type="spellStart"/>
-      <w:r>
-        <w:rPr>
-          <w:bCs/>
-          <w:sz w:val="24"/>
-          <w:szCs w:val="24"/>
-          <w:lang w:val="es-MX"/>
-        </w:rPr>
-        <w:t>python</w:t>
-      </w:r>
-      <w:proofErr w:type="spellEnd"/>
-      <w:r>
-        <w:rPr>
-          <w:bCs/>
-          <w:sz w:val="24"/>
-          <w:szCs w:val="24"/>
-          <w:lang w:val="es-MX"/>
-        </w:rPr>
-        <w:t xml:space="preserve">`. En macOS o Linux, usa </w:t>
-      </w:r>
+        <w:t xml:space="preserve"> y capturas</w:t>
+      </w:r>
+    </w:p>
+    <w:p>
+      <w:pPr>
+        <w:jc w:val="both"/>
+        <w:rPr>
+          <w:bCs/>
+          <w:sz w:val="24"/>
+          <w:szCs w:val="24"/>
+          <w:lang w:val="es-MX"/>
+        </w:rPr>
+      </w:pPr>
+      <w:r>
+        <w:rPr>
+          <w:bCs/>
+          <w:sz w:val="24"/>
+          <w:szCs w:val="24"/>
+          <w:lang w:val="es-MX"/>
+        </w:rPr>
+        <w:t>cargar_csv.py          Cargador original del paquete</w:t>
+      </w:r>
+    </w:p>
+    <w:p>
+      <w:pPr>
+        <w:jc w:val="both"/>
+        <w:rPr>
+          <w:bCs/>
+          <w:sz w:val="24"/>
+          <w:szCs w:val="24"/>
+          <w:lang w:val="es-MX"/>
+        </w:rPr>
+      </w:pPr>
+      <w:proofErr w:type="gramStart"/>
+      <w:r>
+        <w:rPr>
+          <w:bCs/>
+          <w:sz w:val="24"/>
+          <w:szCs w:val="24"/>
+          <w:lang w:val="es-MX"/>
+        </w:rPr>
+        <w:t>ejecutar_escenarios.py  Ejecución</w:t>
+      </w:r>
+      <w:proofErr w:type="gramEnd"/>
+      <w:r>
+        <w:rPr>
+          <w:bCs/>
+          <w:sz w:val="24"/>
+          <w:szCs w:val="24"/>
+          <w:lang w:val="es-MX"/>
+        </w:rPr>
+        <w:t xml:space="preserve"> reproducible de E01 a E15</w:t>
+      </w:r>
+    </w:p>
+    <w:p>
+      <w:pPr>
+        <w:jc w:val="both"/>
+        <w:rPr>
+          <w:bCs/>
+          <w:sz w:val="24"/>
+          <w:szCs w:val="24"/>
+          <w:lang w:val="es-MX"/>
+        </w:rPr>
+      </w:pPr>
+      <w:r>
+        <w:rPr>
+          <w:bCs/>
+          <w:sz w:val="24"/>
+          <w:szCs w:val="24"/>
+          <w:lang w:val="es-MX"/>
+        </w:rPr>
+        <w:t>requirements.txt       Versiones verificadas del entorno</w:t>
+      </w:r>
+    </w:p>
+    <w:p>
+      <w:pPr>
+        <w:jc w:val="both"/>
+        <w:rPr>
+          <w:bCs/>
+          <w:sz w:val="24"/>
+          <w:szCs w:val="24"/>
+          <w:lang w:val="es-MX"/>
+        </w:rPr>
+      </w:pPr>
       <w:proofErr w:type="gramStart"/>
       <w:r>
         <w:rPr>
@@ -2367,783 +3054,6 @@
           <w:szCs w:val="24"/>
           <w:lang w:val="es-MX"/>
         </w:rPr>
-        <w:t>/</w:t>
-      </w:r>
-      <w:proofErr w:type="spellStart"/>
-      <w:r>
-        <w:rPr>
-          <w:bCs/>
-          <w:sz w:val="24"/>
-          <w:szCs w:val="24"/>
-          <w:lang w:val="es-MX"/>
-        </w:rPr>
-        <w:t>bin</w:t>
-      </w:r>
-      <w:proofErr w:type="spellEnd"/>
-      <w:r>
-        <w:rPr>
-          <w:bCs/>
-          <w:sz w:val="24"/>
-          <w:szCs w:val="24"/>
-          <w:lang w:val="es-MX"/>
-        </w:rPr>
-        <w:t>/</w:t>
-      </w:r>
-      <w:proofErr w:type="spellStart"/>
-      <w:r>
-        <w:rPr>
-          <w:bCs/>
-          <w:sz w:val="24"/>
-          <w:szCs w:val="24"/>
-          <w:lang w:val="es-MX"/>
-        </w:rPr>
-        <w:t>python</w:t>
-      </w:r>
-      <w:proofErr w:type="spellEnd"/>
-      <w:r>
-        <w:rPr>
-          <w:bCs/>
-          <w:sz w:val="24"/>
-          <w:szCs w:val="24"/>
-          <w:lang w:val="es-MX"/>
-        </w:rPr>
-        <w:t>`. La instalación ocurre dentro del entorno virtual.</w:t>
-      </w:r>
-    </w:p>
-    <w:p>
-      <w:pPr>
-        <w:jc w:val="both"/>
-        <w:rPr>
-          <w:b/>
-          <w:sz w:val="24"/>
-          <w:szCs w:val="24"/>
-          <w:lang w:val="es-MX"/>
-        </w:rPr>
-      </w:pPr>
-      <w:r>
-        <w:rPr>
-          <w:b/>
-          <w:sz w:val="24"/>
-          <w:szCs w:val="24"/>
-          <w:lang w:val="es-MX"/>
-        </w:rPr>
-        <w:t>Ejecución y comprobación:</w:t>
-      </w:r>
-    </w:p>
-    <w:p>
-      <w:pPr>
-        <w:jc w:val="both"/>
-        <w:rPr>
-          <w:bCs/>
-          <w:sz w:val="24"/>
-          <w:szCs w:val="24"/>
-          <w:lang w:val="es-MX"/>
-        </w:rPr>
-      </w:pPr>
-      <w:r>
-        <w:rPr>
-          <w:bCs/>
-          <w:sz w:val="24"/>
-          <w:szCs w:val="24"/>
-          <w:lang w:val="es-MX"/>
-        </w:rPr>
-        <w:t>Ejecuta desde la raíz del proyecto:</w:t>
-      </w:r>
-    </w:p>
-    <w:p>
-      <w:pPr>
-        <w:jc w:val="both"/>
-        <w:rPr>
-          <w:bCs/>
-          <w:sz w:val="24"/>
-          <w:szCs w:val="24"/>
-          <w:u w:val="single"/>
-          <w:lang w:val="es-MX"/>
-        </w:rPr>
-      </w:pPr>
-      <w:r>
-        <w:rPr>
-          <w:bCs/>
-          <w:sz w:val="24"/>
-          <w:szCs w:val="24"/>
-          <w:u w:val="single"/>
-          <w:lang w:val="es-MX"/>
-        </w:rPr>
-        <w:t>Bash:</w:t>
-      </w:r>
-    </w:p>
-    <w:p>
-      <w:pPr>
-        <w:jc w:val="both"/>
-        <w:rPr>
-          <w:bCs/>
-          <w:sz w:val="24"/>
-          <w:szCs w:val="24"/>
-          <w:lang w:val="es-MX"/>
-        </w:rPr>
-      </w:pPr>
-      <w:proofErr w:type="spellStart"/>
-      <w:r>
-        <w:rPr>
-          <w:bCs/>
-          <w:sz w:val="24"/>
-          <w:szCs w:val="24"/>
-          <w:lang w:val="es-MX"/>
-        </w:rPr>
-        <w:t>python</w:t>
-      </w:r>
-      <w:proofErr w:type="spellEnd"/>
-      <w:r>
-        <w:rPr>
-          <w:bCs/>
-          <w:sz w:val="24"/>
-          <w:szCs w:val="24"/>
-          <w:lang w:val="es-MX"/>
-        </w:rPr>
-        <w:t xml:space="preserve"> cargar_csv.py</w:t>
-      </w:r>
-    </w:p>
-    <w:p>
-      <w:pPr>
-        <w:jc w:val="both"/>
-        <w:rPr>
-          <w:bCs/>
-          <w:sz w:val="24"/>
-          <w:szCs w:val="24"/>
-          <w:lang w:val="es-MX"/>
-        </w:rPr>
-      </w:pPr>
-      <w:proofErr w:type="spellStart"/>
-      <w:r>
-        <w:rPr>
-          <w:bCs/>
-          <w:sz w:val="24"/>
-          <w:szCs w:val="24"/>
-          <w:lang w:val="es-MX"/>
-        </w:rPr>
-        <w:t>python</w:t>
-      </w:r>
-      <w:proofErr w:type="spellEnd"/>
-      <w:r>
-        <w:rPr>
-          <w:bCs/>
-          <w:sz w:val="24"/>
-          <w:szCs w:val="24"/>
-          <w:lang w:val="es-MX"/>
-        </w:rPr>
-        <w:t xml:space="preserve"> ejecutar_escenarios.py</w:t>
-      </w:r>
-    </w:p>
-    <w:p>
-      <w:pPr>
-        <w:jc w:val="both"/>
-        <w:rPr>
-          <w:bCs/>
-          <w:sz w:val="24"/>
-          <w:szCs w:val="24"/>
-          <w:lang w:val="en-US"/>
-        </w:rPr>
-      </w:pPr>
-      <w:r>
-        <w:rPr>
-          <w:bCs/>
-          <w:sz w:val="24"/>
-          <w:szCs w:val="24"/>
-          <w:lang w:val="en-US"/>
-        </w:rPr>
-        <w:t xml:space="preserve">python -m </w:t>
-      </w:r>
-      <w:proofErr w:type="spellStart"/>
-      <w:r>
-        <w:rPr>
-          <w:bCs/>
-          <w:sz w:val="24"/>
-          <w:szCs w:val="24"/>
-          <w:lang w:val="en-US"/>
-        </w:rPr>
-        <w:t>pytest</w:t>
-      </w:r>
-      <w:proofErr w:type="spellEnd"/>
-      <w:r>
-        <w:rPr>
-          <w:bCs/>
-          <w:sz w:val="24"/>
-          <w:szCs w:val="24"/>
-          <w:lang w:val="en-US"/>
-        </w:rPr>
-        <w:t xml:space="preserve"> -q</w:t>
-      </w:r>
-    </w:p>
-    <w:p>
-      <w:pPr>
-        <w:jc w:val="both"/>
-        <w:rPr>
-          <w:bCs/>
-          <w:sz w:val="24"/>
-          <w:szCs w:val="24"/>
-          <w:lang w:val="en-US"/>
-        </w:rPr>
-      </w:pPr>
-      <w:r>
-        <w:rPr>
-          <w:bCs/>
-          <w:sz w:val="24"/>
-          <w:szCs w:val="24"/>
-          <w:lang w:val="en-US"/>
-        </w:rPr>
-        <w:t xml:space="preserve">python -m </w:t>
-      </w:r>
-      <w:proofErr w:type="spellStart"/>
-      <w:r>
-        <w:rPr>
-          <w:bCs/>
-          <w:sz w:val="24"/>
-          <w:szCs w:val="24"/>
-          <w:lang w:val="en-US"/>
-        </w:rPr>
-        <w:t>uvicorn</w:t>
-      </w:r>
-      <w:proofErr w:type="spellEnd"/>
-      <w:r>
-        <w:rPr>
-          <w:bCs/>
-          <w:sz w:val="24"/>
-          <w:szCs w:val="24"/>
-          <w:lang w:val="en-US"/>
-        </w:rPr>
-        <w:t xml:space="preserve"> </w:t>
-      </w:r>
-      <w:proofErr w:type="spellStart"/>
-      <w:r>
-        <w:rPr>
-          <w:bCs/>
-          <w:sz w:val="24"/>
-          <w:szCs w:val="24"/>
-          <w:lang w:val="en-US"/>
-        </w:rPr>
-        <w:t>app.api:app</w:t>
-      </w:r>
-      <w:proofErr w:type="spellEnd"/>
-      <w:r>
-        <w:rPr>
-          <w:bCs/>
-          <w:sz w:val="24"/>
-          <w:szCs w:val="24"/>
-          <w:lang w:val="en-US"/>
-        </w:rPr>
-        <w:t xml:space="preserve"> --reload</w:t>
-      </w:r>
-    </w:p>
-    <w:p>
-      <w:pPr>
-        <w:jc w:val="both"/>
-        <w:rPr>
-          <w:bCs/>
-          <w:sz w:val="24"/>
-          <w:szCs w:val="24"/>
-          <w:lang w:val="es-MX"/>
-        </w:rPr>
-      </w:pPr>
-      <w:r>
-        <w:rPr>
-          <w:bCs/>
-          <w:sz w:val="24"/>
-          <w:szCs w:val="24"/>
-          <w:lang w:val="es-MX"/>
-        </w:rPr>
-        <w:t>El cargador muestra los 16 pedidos en DRAFT. O001 debe tener 4 unidades y 2100.00 MXN. El ejecutor verifica E01 a E15 con datos nuevos por caso y actualiza `evidencias/</w:t>
-      </w:r>
-      <w:proofErr w:type="spellStart"/>
-      <w:r>
-        <w:rPr>
-          <w:bCs/>
-          <w:sz w:val="24"/>
-          <w:szCs w:val="24"/>
-          <w:lang w:val="es-MX"/>
-        </w:rPr>
-        <w:t>escenarios.json</w:t>
-      </w:r>
-      <w:proofErr w:type="spellEnd"/>
-      <w:r>
-        <w:rPr>
-          <w:bCs/>
-          <w:sz w:val="24"/>
-          <w:szCs w:val="24"/>
-          <w:lang w:val="es-MX"/>
-        </w:rPr>
-        <w:t xml:space="preserve">` y `evidencias/bitacora.csv`. </w:t>
-      </w:r>
-      <w:proofErr w:type="spellStart"/>
-      <w:r>
-        <w:rPr>
-          <w:bCs/>
-          <w:sz w:val="24"/>
-          <w:szCs w:val="24"/>
-          <w:lang w:val="es-MX"/>
-        </w:rPr>
-        <w:t>pytest</w:t>
-      </w:r>
-      <w:proofErr w:type="spellEnd"/>
-      <w:r>
-        <w:rPr>
-          <w:bCs/>
-          <w:sz w:val="24"/>
-          <w:szCs w:val="24"/>
-          <w:lang w:val="es-MX"/>
-        </w:rPr>
-        <w:t xml:space="preserve"> debe informar 90 pruebas aprobadas.</w:t>
-      </w:r>
-    </w:p>
-    <w:p>
-      <w:pPr>
-        <w:jc w:val="both"/>
-        <w:rPr>
-          <w:bCs/>
-          <w:sz w:val="24"/>
-          <w:szCs w:val="24"/>
-          <w:lang w:val="es-MX"/>
-        </w:rPr>
-      </w:pPr>
-      <w:r>
-        <w:rPr>
-          <w:bCs/>
-          <w:sz w:val="24"/>
-          <w:szCs w:val="24"/>
-          <w:lang w:val="es-MX"/>
-        </w:rPr>
-        <w:t xml:space="preserve">Swagger se abre en http://127.0.0.1:8000/docs y el contrato </w:t>
-      </w:r>
-      <w:proofErr w:type="spellStart"/>
-      <w:r>
-        <w:rPr>
-          <w:bCs/>
-          <w:sz w:val="24"/>
-          <w:szCs w:val="24"/>
-          <w:lang w:val="es-MX"/>
-        </w:rPr>
-        <w:t>OpenAPI</w:t>
-      </w:r>
-      <w:proofErr w:type="spellEnd"/>
-      <w:r>
-        <w:rPr>
-          <w:bCs/>
-          <w:sz w:val="24"/>
-          <w:szCs w:val="24"/>
-          <w:lang w:val="es-MX"/>
-        </w:rPr>
-        <w:t xml:space="preserve"> está en http://127.0.0.1:8000/openapi.json. Las capturas del reporte usaron el puerto 8764; es la misma aplicación. Detén el servidor con </w:t>
-      </w:r>
-      <w:proofErr w:type="spellStart"/>
-      <w:r>
-        <w:rPr>
-          <w:bCs/>
-          <w:sz w:val="24"/>
-          <w:szCs w:val="24"/>
-          <w:lang w:val="es-MX"/>
-        </w:rPr>
-        <w:t>Ctrl+C</w:t>
-      </w:r>
-      <w:proofErr w:type="spellEnd"/>
-      <w:r>
-        <w:rPr>
-          <w:bCs/>
-          <w:sz w:val="24"/>
-          <w:szCs w:val="24"/>
-          <w:lang w:val="es-MX"/>
-        </w:rPr>
-        <w:t>. Al reiniciarlo, todos los pedidos vuelven a DRAFT.</w:t>
-      </w:r>
-    </w:p>
-    <w:p>
-      <w:pPr>
-        <w:jc w:val="both"/>
-        <w:rPr>
-          <w:b/>
-          <w:sz w:val="24"/>
-          <w:szCs w:val="24"/>
-          <w:lang w:val="es-MX"/>
-        </w:rPr>
-      </w:pPr>
-    </w:p>
-    <w:p>
-      <w:pPr>
-        <w:jc w:val="both"/>
-        <w:rPr>
-          <w:b/>
-          <w:sz w:val="24"/>
-          <w:szCs w:val="24"/>
-          <w:lang w:val="es-MX"/>
-        </w:rPr>
-      </w:pPr>
-    </w:p>
-    <w:p>
-      <w:pPr>
-        <w:jc w:val="both"/>
-        <w:rPr>
-          <w:b/>
-          <w:sz w:val="24"/>
-          <w:szCs w:val="24"/>
-          <w:lang w:val="es-MX"/>
-        </w:rPr>
-      </w:pPr>
-    </w:p>
-    <w:p>
-      <w:pPr>
-        <w:jc w:val="both"/>
-        <w:rPr>
-          <w:b/>
-          <w:sz w:val="24"/>
-          <w:szCs w:val="24"/>
-          <w:lang w:val="es-MX"/>
-        </w:rPr>
-      </w:pPr>
-    </w:p>
-    <w:p>
-      <w:pPr>
-        <w:jc w:val="both"/>
-        <w:rPr>
-          <w:b/>
-          <w:sz w:val="24"/>
-          <w:szCs w:val="24"/>
-          <w:lang w:val="es-MX"/>
-        </w:rPr>
-      </w:pPr>
-      <w:r>
-        <w:rPr>
-          <w:b/>
-          <w:sz w:val="24"/>
-          <w:szCs w:val="24"/>
-          <w:lang w:val="es-MX"/>
-        </w:rPr>
-        <w:lastRenderedPageBreak/>
-        <w:t>Estructura:</w:t>
-      </w:r>
-    </w:p>
-    <w:p>
-      <w:pPr>
-        <w:jc w:val="both"/>
-        <w:rPr>
-          <w:bCs/>
-          <w:sz w:val="24"/>
-          <w:szCs w:val="24"/>
-          <w:lang w:val="es-MX"/>
-        </w:rPr>
-      </w:pPr>
-      <w:r>
-        <w:rPr>
-          <w:bCs/>
-          <w:sz w:val="24"/>
-          <w:szCs w:val="24"/>
-          <w:lang w:val="es-MX"/>
-        </w:rPr>
-        <w:t>app/domain.py          Entidades, VO, estados y eventos</w:t>
-      </w:r>
-    </w:p>
-    <w:p>
-      <w:pPr>
-        <w:jc w:val="both"/>
-        <w:rPr>
-          <w:bCs/>
-          <w:sz w:val="24"/>
-          <w:szCs w:val="24"/>
-          <w:lang w:val="en-US"/>
-        </w:rPr>
-      </w:pPr>
-      <w:proofErr w:type="gramStart"/>
-      <w:r>
-        <w:rPr>
-          <w:bCs/>
-          <w:sz w:val="24"/>
-          <w:szCs w:val="24"/>
-          <w:lang w:val="en-US"/>
-        </w:rPr>
-        <w:t>app/specifications.py  Reglas</w:t>
-      </w:r>
-      <w:proofErr w:type="gramEnd"/>
-      <w:r>
-        <w:rPr>
-          <w:bCs/>
-          <w:sz w:val="24"/>
-          <w:szCs w:val="24"/>
-          <w:lang w:val="en-US"/>
-        </w:rPr>
-        <w:t xml:space="preserve"> AND, OR y NOT; </w:t>
-      </w:r>
-      <w:proofErr w:type="spellStart"/>
-      <w:r>
-        <w:rPr>
-          <w:bCs/>
-          <w:sz w:val="24"/>
-          <w:szCs w:val="24"/>
-          <w:lang w:val="en-US"/>
-        </w:rPr>
-        <w:t>descuentos</w:t>
-      </w:r>
-      <w:proofErr w:type="spellEnd"/>
-    </w:p>
-    <w:p>
-      <w:pPr>
-        <w:jc w:val="both"/>
-        <w:rPr>
-          <w:bCs/>
-          <w:sz w:val="24"/>
-          <w:szCs w:val="24"/>
-          <w:lang w:val="es-MX"/>
-        </w:rPr>
-      </w:pPr>
-      <w:r>
-        <w:rPr>
-          <w:bCs/>
-          <w:sz w:val="24"/>
-          <w:szCs w:val="24"/>
-          <w:lang w:val="es-MX"/>
-        </w:rPr>
-        <w:t xml:space="preserve">app/api.py             Adaptador HTTP y aplicación </w:t>
-      </w:r>
-      <w:proofErr w:type="spellStart"/>
-      <w:r>
-        <w:rPr>
-          <w:bCs/>
-          <w:sz w:val="24"/>
-          <w:szCs w:val="24"/>
-          <w:lang w:val="es-MX"/>
-        </w:rPr>
-        <w:t>FastAPI</w:t>
-      </w:r>
-      <w:proofErr w:type="spellEnd"/>
-    </w:p>
-    <w:p>
-      <w:pPr>
-        <w:jc w:val="both"/>
-        <w:rPr>
-          <w:bCs/>
-          <w:sz w:val="24"/>
-          <w:szCs w:val="24"/>
-          <w:lang w:val="es-MX"/>
-        </w:rPr>
-      </w:pPr>
-      <w:r>
-        <w:rPr>
-          <w:bCs/>
-          <w:sz w:val="24"/>
-          <w:szCs w:val="24"/>
-          <w:lang w:val="es-MX"/>
-        </w:rPr>
-        <w:t xml:space="preserve">datos/                 Los cinco CSV originales del </w:t>
-      </w:r>
-      <w:proofErr w:type="spellStart"/>
-      <w:r>
-        <w:rPr>
-          <w:bCs/>
-          <w:sz w:val="24"/>
-          <w:szCs w:val="24"/>
-          <w:lang w:val="es-MX"/>
-        </w:rPr>
-        <w:t>inge</w:t>
-      </w:r>
-      <w:proofErr w:type="spellEnd"/>
-    </w:p>
-    <w:p>
-      <w:pPr>
-        <w:jc w:val="both"/>
-        <w:rPr>
-          <w:bCs/>
-          <w:sz w:val="24"/>
-          <w:szCs w:val="24"/>
-          <w:lang w:val="es-MX"/>
-        </w:rPr>
-      </w:pPr>
-      <w:proofErr w:type="spellStart"/>
-      <w:r>
-        <w:rPr>
-          <w:bCs/>
-          <w:sz w:val="24"/>
-          <w:szCs w:val="24"/>
-          <w:lang w:val="es-MX"/>
-        </w:rPr>
-        <w:t>tests</w:t>
-      </w:r>
-      <w:proofErr w:type="spellEnd"/>
-      <w:r>
-        <w:rPr>
-          <w:bCs/>
-          <w:sz w:val="24"/>
-          <w:szCs w:val="24"/>
-          <w:lang w:val="es-MX"/>
-        </w:rPr>
-        <w:t>/                 Dominio, reglas, API y escenarios</w:t>
-      </w:r>
-    </w:p>
-    <w:p>
-      <w:pPr>
-        <w:jc w:val="both"/>
-        <w:rPr>
-          <w:bCs/>
-          <w:sz w:val="24"/>
-          <w:szCs w:val="24"/>
-          <w:lang w:val="es-MX"/>
-        </w:rPr>
-      </w:pPr>
-      <w:r>
-        <w:rPr>
-          <w:bCs/>
-          <w:sz w:val="24"/>
-          <w:szCs w:val="24"/>
-          <w:lang w:val="es-MX"/>
-        </w:rPr>
-        <w:t>diagramas/             Draw.io editable y su PNG exportado</w:t>
-      </w:r>
-    </w:p>
-    <w:p>
-      <w:pPr>
-        <w:jc w:val="both"/>
-        <w:rPr>
-          <w:bCs/>
-          <w:sz w:val="24"/>
-          <w:szCs w:val="24"/>
-          <w:lang w:val="es-MX"/>
-        </w:rPr>
-      </w:pPr>
-      <w:r>
-        <w:rPr>
-          <w:bCs/>
-          <w:sz w:val="24"/>
-          <w:szCs w:val="24"/>
-          <w:lang w:val="es-MX"/>
-        </w:rPr>
-        <w:t xml:space="preserve">evidencias/            Bitácora, logs, </w:t>
-      </w:r>
-      <w:proofErr w:type="spellStart"/>
-      <w:r>
-        <w:rPr>
-          <w:bCs/>
-          <w:sz w:val="24"/>
-          <w:szCs w:val="24"/>
-          <w:lang w:val="es-MX"/>
-        </w:rPr>
-        <w:t>OpenAPI</w:t>
-      </w:r>
-      <w:proofErr w:type="spellEnd"/>
-      <w:r>
-        <w:rPr>
-          <w:bCs/>
-          <w:sz w:val="24"/>
-          <w:szCs w:val="24"/>
-          <w:lang w:val="es-MX"/>
-        </w:rPr>
-        <w:t xml:space="preserve"> y capturas</w:t>
-      </w:r>
-    </w:p>
-    <w:p>
-      <w:pPr>
-        <w:jc w:val="both"/>
-        <w:rPr>
-          <w:bCs/>
-          <w:sz w:val="24"/>
-          <w:szCs w:val="24"/>
-          <w:lang w:val="es-MX"/>
-        </w:rPr>
-      </w:pPr>
-      <w:r>
-        <w:rPr>
-          <w:bCs/>
-          <w:sz w:val="24"/>
-          <w:szCs w:val="24"/>
-          <w:lang w:val="es-MX"/>
-        </w:rPr>
-        <w:t>cargar_csv.py          Cargador original del paquete</w:t>
-      </w:r>
-    </w:p>
-    <w:p>
-      <w:pPr>
-        <w:jc w:val="both"/>
-        <w:rPr>
-          <w:bCs/>
-          <w:sz w:val="24"/>
-          <w:szCs w:val="24"/>
-          <w:lang w:val="es-MX"/>
-        </w:rPr>
-      </w:pPr>
-      <w:proofErr w:type="gramStart"/>
-      <w:r>
-        <w:rPr>
-          <w:bCs/>
-          <w:sz w:val="24"/>
-          <w:szCs w:val="24"/>
-          <w:lang w:val="es-MX"/>
-        </w:rPr>
-        <w:t>ejecutar_escenarios.py  Ejecución</w:t>
-      </w:r>
-      <w:proofErr w:type="gramEnd"/>
-      <w:r>
-        <w:rPr>
-          <w:bCs/>
-          <w:sz w:val="24"/>
-          <w:szCs w:val="24"/>
-          <w:lang w:val="es-MX"/>
-        </w:rPr>
-        <w:t xml:space="preserve"> reproducible de E01 a E15</w:t>
-      </w:r>
-    </w:p>
-    <w:p>
-      <w:pPr>
-        <w:jc w:val="both"/>
-        <w:rPr>
-          <w:bCs/>
-          <w:sz w:val="24"/>
-          <w:szCs w:val="24"/>
-          <w:lang w:val="es-MX"/>
-        </w:rPr>
-      </w:pPr>
-      <w:r>
-        <w:rPr>
-          <w:bCs/>
-          <w:sz w:val="24"/>
-          <w:szCs w:val="24"/>
-          <w:lang w:val="es-MX"/>
-        </w:rPr>
-        <w:t>requirements.txt       Versiones verificadas del entorno</w:t>
-      </w:r>
-    </w:p>
-    <w:p>
-      <w:pPr>
-        <w:jc w:val="both"/>
-        <w:rPr>
-          <w:bCs/>
-          <w:sz w:val="24"/>
-          <w:szCs w:val="24"/>
-          <w:lang w:val="es-MX"/>
-        </w:rPr>
-      </w:pPr>
-      <w:proofErr w:type="gramStart"/>
-      <w:r>
-        <w:rPr>
-          <w:bCs/>
-          <w:sz w:val="24"/>
-          <w:szCs w:val="24"/>
-          <w:lang w:val="es-MX"/>
-        </w:rPr>
-        <w:t>`.</w:t>
-      </w:r>
-      <w:proofErr w:type="spellStart"/>
-      <w:r>
-        <w:rPr>
-          <w:bCs/>
-          <w:sz w:val="24"/>
-          <w:szCs w:val="24"/>
-          <w:lang w:val="es-MX"/>
-        </w:rPr>
-        <w:t>venv</w:t>
-      </w:r>
-      <w:proofErr w:type="spellEnd"/>
-      <w:proofErr w:type="gramEnd"/>
-      <w:r>
-        <w:rPr>
-          <w:bCs/>
-          <w:sz w:val="24"/>
-          <w:szCs w:val="24"/>
-          <w:lang w:val="es-MX"/>
-        </w:rPr>
         <w:t>`, `__</w:t>
       </w:r>
       <w:proofErr w:type="spellStart"/>
@@ -3532,6 +3442,7 @@
       <w:r>
         <w:rPr>
           <w:b/>
+          <w:noProof/>
           <w:sz w:val="24"/>
           <w:szCs w:val="24"/>
           <w:lang w:val="es-MX"/>
@@ -3724,80 +3635,8 @@
           <w:bCs/>
           <w:sz w:val="24"/>
           <w:szCs w:val="24"/>
-          <w:lang w:val="en-US"/>
-        </w:rPr>
-        <w:t>1. En POST /</w:t>
-      </w:r>
-      <w:proofErr w:type="gramStart"/>
-      <w:r>
-        <w:rPr>
-          <w:bCs/>
-          <w:sz w:val="24"/>
-          <w:szCs w:val="24"/>
-          <w:lang w:val="en-US"/>
-        </w:rPr>
-        <w:t>orders/{</w:t>
-      </w:r>
-      <w:proofErr w:type="spellStart"/>
-      <w:proofErr w:type="gramEnd"/>
-      <w:r>
-        <w:rPr>
-          <w:bCs/>
-          <w:sz w:val="24"/>
-          <w:szCs w:val="24"/>
-          <w:lang w:val="en-US"/>
-        </w:rPr>
-        <w:t>order_</w:t>
-      </w:r>
-      <w:proofErr w:type="gramStart"/>
-      <w:r>
-        <w:rPr>
-          <w:bCs/>
-          <w:sz w:val="24"/>
-          <w:szCs w:val="24"/>
-          <w:lang w:val="en-US"/>
-        </w:rPr>
-        <w:t>id</w:t>
-      </w:r>
-      <w:proofErr w:type="spellEnd"/>
-      <w:r>
-        <w:rPr>
-          <w:bCs/>
-          <w:sz w:val="24"/>
-          <w:szCs w:val="24"/>
-          <w:lang w:val="en-US"/>
-        </w:rPr>
-        <w:t>}/</w:t>
-      </w:r>
-      <w:proofErr w:type="gramEnd"/>
-      <w:r>
-        <w:rPr>
-          <w:bCs/>
-          <w:sz w:val="24"/>
-          <w:szCs w:val="24"/>
-          <w:lang w:val="en-US"/>
-        </w:rPr>
-        <w:t xml:space="preserve">confirm, </w:t>
-      </w:r>
-      <w:proofErr w:type="spellStart"/>
-      <w:r>
-        <w:rPr>
-          <w:bCs/>
-          <w:sz w:val="24"/>
-          <w:szCs w:val="24"/>
-          <w:lang w:val="en-US"/>
-        </w:rPr>
-        <w:t>pulsa</w:t>
-      </w:r>
-      <w:proofErr w:type="spellEnd"/>
-      <w:r>
-        <w:rPr>
-          <w:bCs/>
-          <w:sz w:val="24"/>
-          <w:szCs w:val="24"/>
-          <w:lang w:val="en-US"/>
-        </w:rPr>
-        <w:t xml:space="preserve"> Try it out y escribe O013. </w:t>
+        </w:rPr>
+        <w:t xml:space="preserve">1. En POST /orders/{order_id}/confirm, pulsa Try it out y escribe O013. </w:t>
       </w:r>
       <w:proofErr w:type="spellStart"/>
       <w:r>
@@ -4017,21 +3856,22 @@
       <w:r>
         <w:rPr>
           <w:b/>
+          <w:noProof/>
           <w:sz w:val="24"/>
           <w:szCs w:val="24"/>
           <w:lang w:val="es-MX"/>
         </w:rPr>
         <w:drawing>
-          <wp:anchor distT="0" distB="0" distL="114300" distR="114300" simplePos="0" relativeHeight="251684864" behindDoc="0" locked="0" layoutInCell="1" allowOverlap="1" wp14:anchorId="5A66D195" wp14:editId="795AD10B">
+          <wp:anchor distT="0" distB="0" distL="114300" distR="114300" simplePos="0" relativeHeight="251684864" behindDoc="0" locked="0" layoutInCell="1" allowOverlap="1" wp14:anchorId="5A66D195" wp14:editId="3AC293E3">
             <wp:simplePos x="0" y="0"/>
             <wp:positionH relativeFrom="column">
-              <wp:posOffset>-193040</wp:posOffset>
+              <wp:posOffset>-189865</wp:posOffset>
             </wp:positionH>
             <wp:positionV relativeFrom="paragraph">
-              <wp:posOffset>350520</wp:posOffset>
+              <wp:posOffset>471805</wp:posOffset>
             </wp:positionV>
-            <wp:extent cx="6123940" cy="4667250"/>
-            <wp:effectExtent l="0" t="0" r="0" b="0"/>
+            <wp:extent cx="6123940" cy="4411980"/>
+            <wp:effectExtent l="0" t="0" r="0" b="7620"/>
             <wp:wrapSquare wrapText="bothSides"/>
             <wp:docPr id="354499618" name="Imagen 1"/>
             <wp:cNvGraphicFramePr>
@@ -4041,7 +3881,7 @@
               <a:graphicData uri="http://schemas.openxmlformats.org/drawingml/2006/picture">
                 <pic:pic xmlns:pic="http://schemas.openxmlformats.org/drawingml/2006/picture">
                   <pic:nvPicPr>
-                    <pic:cNvPr id="354499618" name=""/>
+                    <pic:cNvPr id="354499618" name="Imagen 1"/>
                     <pic:cNvPicPr/>
                   </pic:nvPicPr>
                   <pic:blipFill>
@@ -4059,7 +3899,7 @@
                   <pic:spPr>
                     <a:xfrm>
                       <a:off x="0" y="0"/>
-                      <a:ext cx="6123940" cy="4667250"/>
+                      <a:ext cx="6123940" cy="4411980"/>
                     </a:xfrm>
                     <a:prstGeom prst="rect">
                       <a:avLst/>
@@ -4106,6 +3946,7 @@
       <w:r>
         <w:rPr>
           <w:bCs/>
+          <w:noProof/>
           <w:sz w:val="24"/>
           <w:szCs w:val="24"/>
           <w:lang w:val="es-MX"/>
@@ -4170,6 +4011,7 @@
       <w:r>
         <w:rPr>
           <w:bCs/>
+          <w:noProof/>
           <w:sz w:val="24"/>
           <w:szCs w:val="24"/>
           <w:lang w:val="es-MX"/>
@@ -4299,6 +4141,7 @@
       <w:r>
         <w:rPr>
           <w:bCs/>
+          <w:noProof/>
           <w:sz w:val="24"/>
           <w:szCs w:val="24"/>
           <w:lang w:val="es-MX"/>
@@ -4363,6 +4206,7 @@
       <w:r>
         <w:rPr>
           <w:bCs/>
+          <w:noProof/>
           <w:sz w:val="24"/>
           <w:szCs w:val="24"/>
           <w:lang w:val="es-MX"/>
@@ -4470,6 +4314,7 @@
       <w:r>
         <w:rPr>
           <w:bCs/>
+          <w:noProof/>
           <w:sz w:val="24"/>
           <w:szCs w:val="24"/>
           <w:lang w:val="es-MX"/>
@@ -4581,6 +4426,9 @@
         <w:jc w:val="both"/>
       </w:pPr>
       <w:r>
+        <w:rPr>
+          <w:noProof/>
+        </w:rPr>
         <w:drawing>
           <wp:anchor distT="0" distB="0" distL="114300" distR="114300" simplePos="0" relativeHeight="251677696" behindDoc="0" locked="0" layoutInCell="1" allowOverlap="1" wp14:anchorId="59959818" wp14:editId="5AF8B98B">
             <wp:simplePos x="0" y="0"/>
@@ -5207,10 +5055,7 @@
               </w:rPr>
             </w:pPr>
             <w:r>
-              <w:t>confirmar</w:t>
-            </w:r>
-            <w:r>
-              <w:t>.</w:t>
+              <w:t>confirmar.</w:t>
             </w:r>
           </w:p>
         </w:tc>
@@ -6854,6 +6699,7 @@
                 <w:sz w:val="20"/>
                 <w:szCs w:val="24"/>
               </w:rPr>
+              <w:lastRenderedPageBreak/>
               <w:t>E13</w:t>
             </w:r>
           </w:p>
@@ -7397,6 +7243,7 @@
       </w:pPr>
       <w:r>
         <w:rPr>
+          <w:noProof/>
           <w:sz w:val="24"/>
           <w:szCs w:val="24"/>
           <w:lang w:val="es-MX"/>
@@ -8285,6 +8132,7 @@
       </w:pPr>
       <w:r>
         <w:rPr>
+          <w:noProof/>
           <w:sz w:val="24"/>
           <w:szCs w:val="24"/>
           <w:lang w:val="es-MX"/>
@@ -8515,6 +8363,7 @@
       </w:pPr>
       <w:r>
         <w:rPr>
+          <w:noProof/>
           <w:lang w:val="es-MX"/>
         </w:rPr>
         <w:lastRenderedPageBreak/>
@@ -8692,6 +8541,7 @@
       </w:pPr>
       <w:r>
         <w:rPr>
+          <w:noProof/>
           <w:lang w:val="es-MX"/>
         </w:rPr>
         <w:lastRenderedPageBreak/>
@@ -8811,6 +8661,7 @@
       </w:pPr>
       <w:r>
         <w:rPr>
+          <w:noProof/>
           <w:lang w:val="es-MX"/>
         </w:rPr>
         <w:drawing>
@@ -10344,9 +10195,36 @@
           <w:szCs w:val="24"/>
           <w:lang w:val="es-MX"/>
         </w:rPr>
-        <w:t xml:space="preserve">Durante la validación se observaron rechazos de negocio y un problema del entorno de ejecución. Los rechazos esperados forman parte de la evidencia: resolverlos significa controlar y comunicar la operación inválida, conservando </w:t>
-      </w:r>
-      <w:r>
+        <w:t>Durante la validación se observaron rechazos de negocio y un problema del entorno de ejecución. Los rechazos esperados forman parte de la evidencia: resolverlos significa controlar y comunicar la operación inválida, conservando las reglas del negocio.</w:t>
+      </w:r>
+    </w:p>
+    <w:p>
+      <w:pPr>
+        <w:pStyle w:val="AF4h2"/>
+        <w:jc w:val="both"/>
+        <w:rPr>
+          <w:rFonts w:asciiTheme="minorHAnsi" w:hAnsiTheme="minorHAnsi"/>
+          <w:bCs/>
+          <w:color w:val="auto"/>
+          <w:szCs w:val="24"/>
+          <w:lang w:val="es-MX"/>
+        </w:rPr>
+      </w:pPr>
+      <w:r>
+        <w:rPr>
+          <w:rFonts w:asciiTheme="minorHAnsi" w:hAnsiTheme="minorHAnsi"/>
+          <w:bCs/>
+          <w:color w:val="auto"/>
+          <w:szCs w:val="24"/>
+          <w:lang w:val="es-MX"/>
+        </w:rPr>
+        <w:t>Primer error: exceder el límite de unidades</w:t>
+      </w:r>
+    </w:p>
+    <w:p>
+      <w:pPr>
+        <w:pStyle w:val="AF4body"/>
+        <w:jc w:val="both"/>
         <w:rPr>
           <w:rFonts w:asciiTheme="minorHAnsi" w:hAnsiTheme="minorHAnsi"/>
           <w:color w:val="auto"/>
@@ -10354,8 +10232,7 @@
           <w:szCs w:val="24"/>
           <w:lang w:val="es-MX"/>
         </w:rPr>
-        <w:t>las reglas del negocio</w:t>
-      </w:r>
+      </w:pPr>
       <w:r>
         <w:rPr>
           <w:rFonts w:asciiTheme="minorHAnsi" w:hAnsiTheme="minorHAnsi"/>
@@ -10364,56 +10241,10 @@
           <w:szCs w:val="24"/>
           <w:lang w:val="es-MX"/>
         </w:rPr>
-        <w:t>.</w:t>
-      </w:r>
-    </w:p>
-    <w:p>
-      <w:pPr>
-        <w:pStyle w:val="AF4h2"/>
-        <w:jc w:val="both"/>
-        <w:rPr>
-          <w:rFonts w:asciiTheme="minorHAnsi" w:hAnsiTheme="minorHAnsi"/>
-          <w:bCs/>
-          <w:color w:val="auto"/>
-          <w:szCs w:val="24"/>
-          <w:lang w:val="es-MX"/>
-        </w:rPr>
-      </w:pPr>
-      <w:r>
-        <w:rPr>
-          <w:rFonts w:asciiTheme="minorHAnsi" w:hAnsiTheme="minorHAnsi"/>
-          <w:bCs/>
-          <w:color w:val="auto"/>
-          <w:szCs w:val="24"/>
-          <w:lang w:val="es-MX"/>
-        </w:rPr>
-        <w:t>Primer error</w:t>
-      </w:r>
-      <w:r>
-        <w:rPr>
-          <w:rFonts w:asciiTheme="minorHAnsi" w:hAnsiTheme="minorHAnsi"/>
-          <w:bCs/>
-          <w:color w:val="auto"/>
-          <w:szCs w:val="24"/>
-          <w:lang w:val="es-MX"/>
-        </w:rPr>
-        <w:t>:</w:t>
-      </w:r>
-      <w:r>
-        <w:rPr>
-          <w:rFonts w:asciiTheme="minorHAnsi" w:hAnsiTheme="minorHAnsi"/>
-          <w:bCs/>
-          <w:color w:val="auto"/>
-          <w:szCs w:val="24"/>
-          <w:lang w:val="es-MX"/>
-        </w:rPr>
-        <w:t xml:space="preserve"> exceder el límite de unidades</w:t>
-      </w:r>
-    </w:p>
-    <w:p>
-      <w:pPr>
-        <w:pStyle w:val="AF4body"/>
-        <w:jc w:val="both"/>
+        <w:t xml:space="preserve">En E08, O009 tenía 19 unidades y se intentaron agregar dos. La operación lanzó </w:t>
+      </w:r>
+      <w:proofErr w:type="spellStart"/>
+      <w:r>
         <w:rPr>
           <w:rFonts w:asciiTheme="minorHAnsi" w:hAnsiTheme="minorHAnsi"/>
           <w:color w:val="auto"/>
@@ -10421,7 +10252,9 @@
           <w:szCs w:val="24"/>
           <w:lang w:val="es-MX"/>
         </w:rPr>
-      </w:pPr>
+        <w:t>OrderItemLimitExceeded</w:t>
+      </w:r>
+      <w:proofErr w:type="spellEnd"/>
       <w:r>
         <w:rPr>
           <w:rFonts w:asciiTheme="minorHAnsi" w:hAnsiTheme="minorHAnsi"/>
@@ -10430,10 +10263,36 @@
           <w:szCs w:val="24"/>
           <w:lang w:val="es-MX"/>
         </w:rPr>
-        <w:t xml:space="preserve">En E08, O009 tenía 19 unidades y se intentaron agregar dos. La operación lanzó </w:t>
-      </w:r>
-      <w:proofErr w:type="spellStart"/>
-      <w:r>
+        <w:t>. La solución consiste en validar la suma antes de modificar la lista y solicitar una cantidad que no exceda el máximo. La prueba confirmó que se conservaron 19 unidades y el importe previo. El aprendizaje es distinguir la cantidad de renglones de la suma de unidades.</w:t>
+      </w:r>
+    </w:p>
+    <w:p>
+      <w:pPr>
+        <w:pStyle w:val="AF4h2"/>
+        <w:jc w:val="both"/>
+        <w:rPr>
+          <w:rFonts w:asciiTheme="minorHAnsi" w:hAnsiTheme="minorHAnsi"/>
+          <w:bCs/>
+          <w:color w:val="auto"/>
+          <w:szCs w:val="24"/>
+          <w:lang w:val="es-MX"/>
+        </w:rPr>
+      </w:pPr>
+      <w:r>
+        <w:rPr>
+          <w:rFonts w:asciiTheme="minorHAnsi" w:hAnsiTheme="minorHAnsi"/>
+          <w:bCs/>
+          <w:color w:val="auto"/>
+          <w:szCs w:val="24"/>
+          <w:lang w:val="es-MX"/>
+        </w:rPr>
+        <w:t>Segundo error: repetir una confirmación</w:t>
+      </w:r>
+    </w:p>
+    <w:p>
+      <w:pPr>
+        <w:pStyle w:val="AF4body"/>
+        <w:jc w:val="both"/>
         <w:rPr>
           <w:rFonts w:asciiTheme="minorHAnsi" w:hAnsiTheme="minorHAnsi"/>
           <w:color w:val="auto"/>
@@ -10441,9 +10300,7 @@
           <w:szCs w:val="24"/>
           <w:lang w:val="es-MX"/>
         </w:rPr>
-        <w:t>OrderItemLimitExceeded</w:t>
-      </w:r>
-      <w:proofErr w:type="spellEnd"/>
+      </w:pPr>
       <w:r>
         <w:rPr>
           <w:rFonts w:asciiTheme="minorHAnsi" w:hAnsiTheme="minorHAnsi"/>
@@ -10452,56 +10309,11 @@
           <w:szCs w:val="24"/>
           <w:lang w:val="es-MX"/>
         </w:rPr>
-        <w:t>. La solución consiste en validar la suma antes de modificar la lista y solicitar una cantidad que no exceda el máximo. La prueba confirmó que se conservaron 19 unidades y el importe previo. El aprendizaje es distinguir la cantidad de renglones de la suma de unidades.</w:t>
-      </w:r>
-    </w:p>
-    <w:p>
-      <w:pPr>
-        <w:pStyle w:val="AF4h2"/>
-        <w:jc w:val="both"/>
-        <w:rPr>
-          <w:rFonts w:asciiTheme="minorHAnsi" w:hAnsiTheme="minorHAnsi"/>
-          <w:bCs/>
-          <w:color w:val="auto"/>
-          <w:szCs w:val="24"/>
-          <w:lang w:val="es-MX"/>
-        </w:rPr>
-      </w:pPr>
-      <w:r>
-        <w:rPr>
-          <w:rFonts w:asciiTheme="minorHAnsi" w:hAnsiTheme="minorHAnsi"/>
-          <w:bCs/>
-          <w:color w:val="auto"/>
-          <w:szCs w:val="24"/>
-          <w:lang w:val="es-MX"/>
-        </w:rPr>
-        <w:t>Segundo error</w:t>
-      </w:r>
-      <w:r>
-        <w:rPr>
-          <w:rFonts w:asciiTheme="minorHAnsi" w:hAnsiTheme="minorHAnsi"/>
-          <w:bCs/>
-          <w:color w:val="auto"/>
-          <w:szCs w:val="24"/>
-          <w:lang w:val="es-MX"/>
-        </w:rPr>
-        <w:t>:</w:t>
-      </w:r>
-      <w:r>
-        <w:rPr>
-          <w:rFonts w:asciiTheme="minorHAnsi" w:hAnsiTheme="minorHAnsi"/>
-          <w:bCs/>
-          <w:color w:val="auto"/>
-          <w:szCs w:val="24"/>
-          <w:lang w:val="es-MX"/>
-        </w:rPr>
-        <w:t xml:space="preserve"> repetir una confirmación</w:t>
-      </w:r>
-    </w:p>
-    <w:p>
-      <w:pPr>
-        <w:pStyle w:val="AF4body"/>
-        <w:jc w:val="both"/>
+        <w:t xml:space="preserve">En E12 y en Swagger se llamó </w:t>
+      </w:r>
+      <w:proofErr w:type="spellStart"/>
+      <w:proofErr w:type="gramStart"/>
+      <w:r>
         <w:rPr>
           <w:rFonts w:asciiTheme="minorHAnsi" w:hAnsiTheme="minorHAnsi"/>
           <w:color w:val="auto"/>
@@ -10509,7 +10321,9 @@
           <w:szCs w:val="24"/>
           <w:lang w:val="es-MX"/>
         </w:rPr>
-      </w:pPr>
+        <w:t>confirm</w:t>
+      </w:r>
+      <w:proofErr w:type="spellEnd"/>
       <w:r>
         <w:rPr>
           <w:rFonts w:asciiTheme="minorHAnsi" w:hAnsiTheme="minorHAnsi"/>
@@ -10518,10 +10332,9 @@
           <w:szCs w:val="24"/>
           <w:lang w:val="es-MX"/>
         </w:rPr>
-        <w:t xml:space="preserve">En E12 y en Swagger se llamó </w:t>
-      </w:r>
-      <w:proofErr w:type="spellStart"/>
-      <w:proofErr w:type="gramStart"/>
+        <w:t>(</w:t>
+      </w:r>
+      <w:proofErr w:type="gramEnd"/>
       <w:r>
         <w:rPr>
           <w:rFonts w:asciiTheme="minorHAnsi" w:hAnsiTheme="minorHAnsi"/>
@@ -10530,9 +10343,9 @@
           <w:szCs w:val="24"/>
           <w:lang w:val="es-MX"/>
         </w:rPr>
-        <w:t>confirm</w:t>
-      </w:r>
-      <w:proofErr w:type="spellEnd"/>
+        <w:t xml:space="preserve">) sobre un pedido ya CONFIRMED. Se obtuvo </w:t>
+      </w:r>
+      <w:proofErr w:type="spellStart"/>
       <w:r>
         <w:rPr>
           <w:rFonts w:asciiTheme="minorHAnsi" w:hAnsiTheme="minorHAnsi"/>
@@ -10541,9 +10354,9 @@
           <w:szCs w:val="24"/>
           <w:lang w:val="es-MX"/>
         </w:rPr>
-        <w:t>(</w:t>
-      </w:r>
-      <w:proofErr w:type="gramEnd"/>
+        <w:t>InvalidOrderTransition</w:t>
+      </w:r>
+      <w:proofErr w:type="spellEnd"/>
       <w:r>
         <w:rPr>
           <w:rFonts w:asciiTheme="minorHAnsi" w:hAnsiTheme="minorHAnsi"/>
@@ -10552,72 +10365,30 @@
           <w:szCs w:val="24"/>
           <w:lang w:val="es-MX"/>
         </w:rPr>
-        <w:t xml:space="preserve">) sobre un pedido ya CONFIRMED. Se obtuvo </w:t>
-      </w:r>
-      <w:proofErr w:type="spellStart"/>
-      <w:r>
+        <w:t xml:space="preserve"> y HTTP 409. La solución fue proteger el origen permitido y no emitir otro evento. Para repetir una prueba desde el inicio se usa un fixture nuevo o se reinicia el servidor. El aprendizaje es que ejecutar un comando dos veces requiere considerar el ciclo de vida del pedido.</w:t>
+      </w:r>
+    </w:p>
+    <w:p>
+      <w:pPr>
+        <w:pStyle w:val="AF4h2"/>
+        <w:jc w:val="both"/>
         <w:rPr>
           <w:rFonts w:asciiTheme="minorHAnsi" w:hAnsiTheme="minorHAnsi"/>
+          <w:bCs/>
           <w:color w:val="auto"/>
-          <w:sz w:val="24"/>
-          <w:szCs w:val="24"/>
-          <w:lang w:val="es-MX"/>
-        </w:rPr>
-        <w:t>InvalidOrderTransition</w:t>
-      </w:r>
-      <w:proofErr w:type="spellEnd"/>
+          <w:szCs w:val="24"/>
+          <w:lang w:val="es-MX"/>
+        </w:rPr>
+      </w:pPr>
       <w:r>
         <w:rPr>
           <w:rFonts w:asciiTheme="minorHAnsi" w:hAnsiTheme="minorHAnsi"/>
+          <w:bCs/>
           <w:color w:val="auto"/>
-          <w:sz w:val="24"/>
-          <w:szCs w:val="24"/>
-          <w:lang w:val="es-MX"/>
-        </w:rPr>
-        <w:t xml:space="preserve"> y HTTP 409. La solución fue proteger el origen permitido y no emitir otro evento. Para repetir una prueba desde el inicio se usa un fixture nuevo o se reinicia el servidor. El aprendizaje es que ejecutar un comando dos veces requiere considerar el ciclo de vida del pedido.</w:t>
-      </w:r>
-    </w:p>
-    <w:p>
-      <w:pPr>
-        <w:pStyle w:val="AF4h2"/>
-        <w:jc w:val="both"/>
-        <w:rPr>
-          <w:rFonts w:asciiTheme="minorHAnsi" w:hAnsiTheme="minorHAnsi"/>
-          <w:bCs/>
-          <w:color w:val="auto"/>
-          <w:szCs w:val="24"/>
-          <w:lang w:val="es-MX"/>
-        </w:rPr>
-      </w:pPr>
-      <w:r>
-        <w:rPr>
-          <w:rFonts w:asciiTheme="minorHAnsi" w:hAnsiTheme="minorHAnsi"/>
-          <w:bCs/>
-          <w:color w:val="auto"/>
-          <w:szCs w:val="24"/>
-          <w:lang w:val="es-MX"/>
-        </w:rPr>
-        <w:t>Tercer error</w:t>
-      </w:r>
-      <w:r>
-        <w:rPr>
-          <w:rFonts w:asciiTheme="minorHAnsi" w:hAnsiTheme="minorHAnsi"/>
-          <w:bCs/>
-          <w:color w:val="auto"/>
-          <w:szCs w:val="24"/>
-          <w:lang w:val="es-MX"/>
-        </w:rPr>
-        <w:t>:</w:t>
-      </w:r>
-      <w:r>
-        <w:rPr>
-          <w:rFonts w:asciiTheme="minorHAnsi" w:hAnsiTheme="minorHAnsi"/>
-          <w:bCs/>
-          <w:color w:val="auto"/>
-          <w:szCs w:val="24"/>
-          <w:lang w:val="es-MX"/>
-        </w:rPr>
-        <w:t xml:space="preserve"> ejecutar </w:t>
+          <w:szCs w:val="24"/>
+          <w:lang w:val="es-MX"/>
+        </w:rPr>
+        <w:t xml:space="preserve">Tercer error: ejecutar </w:t>
       </w:r>
       <w:proofErr w:type="spellStart"/>
       <w:r>
@@ -11285,18 +11056,16 @@
         </w:rPr>
         <w:t xml:space="preserve">Permite nombrar, probar y reutilizar condiciones sin modificar el pedido. </w:t>
       </w:r>
-      <w:proofErr w:type="spellStart"/>
       <w:r>
         <w:rPr>
           <w:rFonts w:asciiTheme="minorHAnsi" w:hAnsiTheme="minorHAnsi"/>
           <w:color w:val="auto"/>
           <w:sz w:val="24"/>
           <w:szCs w:val="24"/>
-          <w:lang w:val="es-MX"/>
-        </w:rPr>
-        <w:t>MinimumAmountSpec</w:t>
-      </w:r>
-      <w:proofErr w:type="spellEnd"/>
+          <w:lang w:val="en-US"/>
+        </w:rPr>
+        <w:t xml:space="preserve">MinimumAmountSpec, VIPCustomerSpec, MinimumUnitsSpec y ActivePromotionSpec se componen con AND, OR y NOT. </w:t>
+      </w:r>
       <w:r>
         <w:rPr>
           <w:rFonts w:asciiTheme="minorHAnsi" w:hAnsiTheme="minorHAnsi"/>
@@ -11305,73 +11074,7 @@
           <w:szCs w:val="24"/>
           <w:lang w:val="es-MX"/>
         </w:rPr>
-        <w:t xml:space="preserve">, </w:t>
-      </w:r>
-      <w:proofErr w:type="spellStart"/>
-      <w:r>
-        <w:rPr>
-          <w:rFonts w:asciiTheme="minorHAnsi" w:hAnsiTheme="minorHAnsi"/>
-          <w:color w:val="auto"/>
-          <w:sz w:val="24"/>
-          <w:szCs w:val="24"/>
-          <w:lang w:val="es-MX"/>
-        </w:rPr>
-        <w:t>VIPCustomerSpec</w:t>
-      </w:r>
-      <w:proofErr w:type="spellEnd"/>
-      <w:r>
-        <w:rPr>
-          <w:rFonts w:asciiTheme="minorHAnsi" w:hAnsiTheme="minorHAnsi"/>
-          <w:color w:val="auto"/>
-          <w:sz w:val="24"/>
-          <w:szCs w:val="24"/>
-          <w:lang w:val="es-MX"/>
-        </w:rPr>
-        <w:t xml:space="preserve">, </w:t>
-      </w:r>
-      <w:proofErr w:type="spellStart"/>
-      <w:r>
-        <w:rPr>
-          <w:rFonts w:asciiTheme="minorHAnsi" w:hAnsiTheme="minorHAnsi"/>
-          <w:color w:val="auto"/>
-          <w:sz w:val="24"/>
-          <w:szCs w:val="24"/>
-          <w:lang w:val="es-MX"/>
-        </w:rPr>
-        <w:t>MinimumUnitsSpec</w:t>
-      </w:r>
-      <w:proofErr w:type="spellEnd"/>
-      <w:r>
-        <w:rPr>
-          <w:rFonts w:asciiTheme="minorHAnsi" w:hAnsiTheme="minorHAnsi"/>
-          <w:color w:val="auto"/>
-          <w:sz w:val="24"/>
-          <w:szCs w:val="24"/>
-          <w:lang w:val="es-MX"/>
-        </w:rPr>
-        <w:t xml:space="preserve"> y </w:t>
-      </w:r>
-      <w:proofErr w:type="spellStart"/>
-      <w:r>
-        <w:rPr>
-          <w:rFonts w:asciiTheme="minorHAnsi" w:hAnsiTheme="minorHAnsi"/>
-          <w:color w:val="auto"/>
-          <w:sz w:val="24"/>
-          <w:szCs w:val="24"/>
-          <w:lang w:val="es-MX"/>
-        </w:rPr>
-        <w:t>ActivePromotionSpec</w:t>
-      </w:r>
-      <w:proofErr w:type="spellEnd"/>
-      <w:r>
-        <w:rPr>
-          <w:rFonts w:asciiTheme="minorHAnsi" w:hAnsiTheme="minorHAnsi"/>
-          <w:color w:val="auto"/>
-          <w:sz w:val="24"/>
-          <w:szCs w:val="24"/>
-          <w:lang w:val="es-MX"/>
-        </w:rPr>
-        <w:t xml:space="preserve"> se componen con AND, OR y NOT. Así se separa la elegibilidad de la operación que calcula el importe del descuento, y la misma política puede usarse desde distintas interfaces.</w:t>
+        <w:t>Así se separa la elegibilidad de la operación que calcula el importe del descuento, y la misma política puede usarse desde distintas interfaces.</w:t>
       </w:r>
     </w:p>
     <w:p>
@@ -16034,6 +15737,7 @@
   <w:style w:type="character" w:default="1" w:styleId="Fuentedeprrafopredeter">
     <w:name w:val="Default Paragraph Font"/>
     <w:uiPriority w:val="1"/>
+    <w:semiHidden/>
     <w:unhideWhenUsed/>
   </w:style>
   <w:style w:type="table" w:default="1" w:styleId="Tablanormal">
@@ -16794,6 +16498,15 @@
 </file>
 
 <file path=customXml/item1.xml><?xml version="1.0" encoding="utf-8"?>
+<?mso-contentType ?>
+<FormTemplates xmlns="http://schemas.microsoft.com/sharepoint/v3/contenttype/forms">
+  <Display>DocumentLibraryForm</Display>
+  <Edit>DocumentLibraryForm</Edit>
+  <New>DocumentLibraryForm</New>
+</FormTemplates>
+</file>
+
+<file path=customXml/item2.xml><?xml version="1.0" encoding="utf-8"?>
 <ct:contentTypeSchema xmlns:ct="http://schemas.microsoft.com/office/2006/metadata/contentType" xmlns:ma="http://schemas.microsoft.com/office/2006/metadata/properties/metaAttributes" ct:_="" ma:_="" ma:contentTypeName="Documento" ma:contentTypeID="0x0101002DF60299A8DF8B4D9A323BE955188E87" ma:contentTypeVersion="0" ma:contentTypeDescription="Crear nuevo documento." ma:contentTypeScope="" ma:versionID="ff3fa225fd52f309ca8fb6e540d8f9c7">
   <xsd:schema xmlns:xsd="http://www.w3.org/2001/XMLSchema" xmlns:xs="http://www.w3.org/2001/XMLSchema" xmlns:p="http://schemas.microsoft.com/office/2006/metadata/properties" targetNamespace="http://schemas.microsoft.com/office/2006/metadata/properties" ma:root="true" ma:fieldsID="26ff3a126252e742cc2543983a566b0e">
     <xsd:element name="properties">
@@ -16907,22 +16620,7 @@
 </ct:contentTypeSchema>
 </file>
 
-<file path=customXml/item2.xml><?xml version="1.0" encoding="utf-8"?>
-<?mso-contentType ?>
-<FormTemplates xmlns="http://schemas.microsoft.com/sharepoint/v3/contenttype/forms">
-  <Display>DocumentLibraryForm</Display>
-  <Edit>DocumentLibraryForm</Edit>
-  <New>DocumentLibraryForm</New>
-</FormTemplates>
-</file>
-
 <file path=customXml/item3.xml><?xml version="1.0" encoding="utf-8"?>
-<p:properties xmlns:p="http://schemas.microsoft.com/office/2006/metadata/properties" xmlns:xsi="http://www.w3.org/2001/XMLSchema-instance" xmlns:pc="http://schemas.microsoft.com/office/infopath/2007/PartnerControls">
-  <documentManagement/>
-</p:properties>
-</file>
-
-<file path=customXml/item4.xml><?xml version="1.0" encoding="utf-8"?>
 <b:Sources xmlns:b="http://schemas.openxmlformats.org/officeDocument/2006/bibliography" xmlns="http://schemas.openxmlformats.org/officeDocument/2006/bibliography" SelectedStyle="\APASixthEditionOfficeOnline.xsl" StyleName="APA" Version="6">
   <b:Source>
     <b:Tag>Pat14</b:Tag>
@@ -16968,7 +16666,21 @@
 </b:Sources>
 </file>
 
+<file path=customXml/item4.xml><?xml version="1.0" encoding="utf-8"?>
+<p:properties xmlns:p="http://schemas.microsoft.com/office/2006/metadata/properties" xmlns:xsi="http://www.w3.org/2001/XMLSchema-instance" xmlns:pc="http://schemas.microsoft.com/office/infopath/2007/PartnerControls">
+  <documentManagement/>
+</p:properties>
+</file>
+
 <file path=customXml/itemProps1.xml><?xml version="1.0" encoding="utf-8"?>
+<ds:datastoreItem xmlns:ds="http://schemas.openxmlformats.org/officeDocument/2006/customXml" ds:itemID="{5668D8BA-0569-4F13-AA79-CB46EED8A15A}">
+  <ds:schemaRefs>
+    <ds:schemaRef ds:uri="http://schemas.microsoft.com/sharepoint/v3/contenttype/forms"/>
+  </ds:schemaRefs>
+</ds:datastoreItem>
+</file>
+
+<file path=customXml/itemProps2.xml><?xml version="1.0" encoding="utf-8"?>
 <ds:datastoreItem xmlns:ds="http://schemas.openxmlformats.org/officeDocument/2006/customXml" ds:itemID="{71EFBA9E-882D-4048-A715-2B943DBF8AC6}">
   <ds:schemaRefs>
     <ds:schemaRef ds:uri="http://schemas.microsoft.com/office/2006/metadata/contentType"/>
@@ -16984,27 +16696,19 @@
 </ds:datastoreItem>
 </file>
 
-<file path=customXml/itemProps2.xml><?xml version="1.0" encoding="utf-8"?>
-<ds:datastoreItem xmlns:ds="http://schemas.openxmlformats.org/officeDocument/2006/customXml" ds:itemID="{5668D8BA-0569-4F13-AA79-CB46EED8A15A}">
+<file path=customXml/itemProps3.xml><?xml version="1.0" encoding="utf-8"?>
+<ds:datastoreItem xmlns:ds="http://schemas.openxmlformats.org/officeDocument/2006/customXml" ds:itemID="{F786034B-87C8-0A4C-9F85-FB6696FED8C5}">
   <ds:schemaRefs>
-    <ds:schemaRef ds:uri="http://schemas.microsoft.com/sharepoint/v3/contenttype/forms"/>
+    <ds:schemaRef ds:uri="http://schemas.openxmlformats.org/officeDocument/2006/bibliography"/>
   </ds:schemaRefs>
 </ds:datastoreItem>
 </file>
 
-<file path=customXml/itemProps3.xml><?xml version="1.0" encoding="utf-8"?>
+<file path=customXml/itemProps4.xml><?xml version="1.0" encoding="utf-8"?>
 <ds:datastoreItem xmlns:ds="http://schemas.openxmlformats.org/officeDocument/2006/customXml" ds:itemID="{A5F50B1D-538B-42A4-B3DB-9104BB6453D9}">
   <ds:schemaRefs>
     <ds:schemaRef ds:uri="http://schemas.microsoft.com/office/2006/metadata/properties"/>
     <ds:schemaRef ds:uri="http://schemas.microsoft.com/office/infopath/2007/PartnerControls"/>
   </ds:schemaRefs>
 </ds:datastoreItem>
-</file>
-
-<file path=customXml/itemProps4.xml><?xml version="1.0" encoding="utf-8"?>
-<ds:datastoreItem xmlns:ds="http://schemas.openxmlformats.org/officeDocument/2006/customXml" ds:itemID="{F786034B-87C8-0A4C-9F85-FB6696FED8C5}">
-  <ds:schemaRefs>
-    <ds:schemaRef ds:uri="http://schemas.openxmlformats.org/officeDocument/2006/bibliography"/>
-  </ds:schemaRefs>
-</ds:datastoreItem>
 </file>
</xml_diff>